<commit_message>
Finish Personal Report and Suggested Architecture
</commit_message>
<xml_diff>
--- a/Personal Document/COS40005 Research Report-Truong Ngoc Gia Hieu - SWS01217 - 105565520.docx
+++ b/Personal Document/COS40005 Research Report-Truong Ngoc Gia Hieu - SWS01217 - 105565520.docx
@@ -4,15 +4,16 @@
   <w:body>
     <w:p>
       <w:pPr>
-        <w:pStyle w:val="45"/>
+        <w:pStyle w:val="46"/>
         <w:spacing w:line="240" w:lineRule="auto"/>
+        <w:jc w:val="both"/>
         <w:rPr>
           <w:rFonts w:hint="default" w:ascii="Times New Roman" w:hAnsi="Times New Roman" w:cs="Times New Roman"/>
         </w:rPr>
       </w:pPr>
       <w:bookmarkStart w:id="0" w:name="_Toc318188327"/>
-      <w:bookmarkStart w:id="1" w:name="_Toc321147011"/>
-      <w:bookmarkStart w:id="2" w:name="_Toc318189312"/>
+      <w:bookmarkStart w:id="1" w:name="_Toc318189312"/>
+      <w:bookmarkStart w:id="2" w:name="_Toc321147011"/>
       <w:bookmarkStart w:id="3" w:name="_Toc318188227"/>
       <w:bookmarkStart w:id="4" w:name="_Toc321147149"/>
     </w:p>
@@ -23,43 +24,47 @@
     <w:bookmarkEnd w:id="4"/>
     <w:p>
       <w:pPr>
-        <w:pStyle w:val="38"/>
+        <w:pStyle w:val="39"/>
         <w:spacing w:line="240" w:lineRule="auto"/>
-        <w:rPr>
-          <w:rFonts w:hint="default" w:ascii="Times New Roman" w:hAnsi="Times New Roman" w:cs="Times New Roman"/>
-        </w:rPr>
-      </w:pPr>
-    </w:p>
-    <w:p>
-      <w:pPr>
-        <w:pStyle w:val="38"/>
+        <w:jc w:val="both"/>
+        <w:rPr>
+          <w:rFonts w:hint="default" w:ascii="Times New Roman" w:hAnsi="Times New Roman" w:cs="Times New Roman"/>
+        </w:rPr>
+      </w:pPr>
+    </w:p>
+    <w:p>
+      <w:pPr>
+        <w:pStyle w:val="39"/>
         <w:spacing w:line="240" w:lineRule="auto"/>
-        <w:rPr>
-          <w:rFonts w:hint="default" w:ascii="Times New Roman" w:hAnsi="Times New Roman" w:cs="Times New Roman"/>
-        </w:rPr>
-      </w:pPr>
-    </w:p>
-    <w:p>
-      <w:pPr>
-        <w:pStyle w:val="38"/>
+        <w:jc w:val="both"/>
+        <w:rPr>
+          <w:rFonts w:hint="default" w:ascii="Times New Roman" w:hAnsi="Times New Roman" w:cs="Times New Roman"/>
+        </w:rPr>
+      </w:pPr>
+    </w:p>
+    <w:p>
+      <w:pPr>
+        <w:pStyle w:val="39"/>
         <w:spacing w:line="240" w:lineRule="auto"/>
-        <w:rPr>
-          <w:rFonts w:hint="default" w:ascii="Times New Roman" w:hAnsi="Times New Roman" w:cs="Times New Roman"/>
-        </w:rPr>
-      </w:pPr>
-    </w:p>
-    <w:p>
-      <w:pPr>
-        <w:pStyle w:val="38"/>
+        <w:jc w:val="both"/>
+        <w:rPr>
+          <w:rFonts w:hint="default" w:ascii="Times New Roman" w:hAnsi="Times New Roman" w:cs="Times New Roman"/>
+        </w:rPr>
+      </w:pPr>
+    </w:p>
+    <w:p>
+      <w:pPr>
+        <w:pStyle w:val="39"/>
         <w:spacing w:line="240" w:lineRule="auto"/>
-        <w:rPr>
-          <w:rFonts w:hint="default" w:ascii="Times New Roman" w:hAnsi="Times New Roman" w:cs="Times New Roman"/>
-        </w:rPr>
-      </w:pPr>
-    </w:p>
-    <w:p>
-      <w:pPr>
-        <w:pStyle w:val="38"/>
+        <w:jc w:val="both"/>
+        <w:rPr>
+          <w:rFonts w:hint="default" w:ascii="Times New Roman" w:hAnsi="Times New Roman" w:cs="Times New Roman"/>
+        </w:rPr>
+      </w:pPr>
+    </w:p>
+    <w:p>
+      <w:pPr>
+        <w:pStyle w:val="39"/>
         <w:spacing w:line="240" w:lineRule="auto"/>
         <w:jc w:val="both"/>
         <w:rPr>
@@ -69,7 +74,7 @@
     </w:p>
     <w:p>
       <w:pPr>
-        <w:pStyle w:val="38"/>
+        <w:pStyle w:val="39"/>
         <w:spacing w:line="240" w:lineRule="auto"/>
         <w:jc w:val="both"/>
         <w:rPr>
@@ -79,8 +84,9 @@
     </w:p>
     <w:p>
       <w:pPr>
-        <w:pStyle w:val="38"/>
+        <w:pStyle w:val="39"/>
         <w:spacing w:line="240" w:lineRule="auto"/>
+        <w:jc w:val="both"/>
         <w:rPr>
           <w:rFonts w:hint="default" w:ascii="Times New Roman" w:hAnsi="Times New Roman" w:cs="Times New Roman"/>
         </w:rPr>
@@ -94,8 +100,9 @@
     </w:p>
     <w:p>
       <w:pPr>
-        <w:pStyle w:val="36"/>
+        <w:pStyle w:val="37"/>
         <w:spacing w:line="240" w:lineRule="auto"/>
+        <w:jc w:val="both"/>
         <w:rPr>
           <w:rFonts w:hint="default" w:ascii="Times New Roman" w:hAnsi="Times New Roman" w:cs="Times New Roman"/>
         </w:rPr>
@@ -139,26 +146,29 @@
     </w:p>
     <w:p>
       <w:pPr>
-        <w:pStyle w:val="36"/>
+        <w:pStyle w:val="37"/>
         <w:spacing w:line="240" w:lineRule="auto"/>
-        <w:rPr>
-          <w:rFonts w:hint="default" w:ascii="Times New Roman" w:hAnsi="Times New Roman" w:cs="Times New Roman"/>
-        </w:rPr>
-      </w:pPr>
-    </w:p>
-    <w:p>
-      <w:pPr>
-        <w:pStyle w:val="36"/>
+        <w:jc w:val="both"/>
+        <w:rPr>
+          <w:rFonts w:hint="default" w:ascii="Times New Roman" w:hAnsi="Times New Roman" w:cs="Times New Roman"/>
+        </w:rPr>
+      </w:pPr>
+    </w:p>
+    <w:p>
+      <w:pPr>
+        <w:pStyle w:val="37"/>
         <w:spacing w:line="240" w:lineRule="auto"/>
-        <w:rPr>
-          <w:rFonts w:hint="default" w:ascii="Times New Roman" w:hAnsi="Times New Roman" w:cs="Times New Roman"/>
-        </w:rPr>
-      </w:pPr>
-    </w:p>
-    <w:p>
-      <w:pPr>
-        <w:pStyle w:val="36"/>
+        <w:jc w:val="both"/>
+        <w:rPr>
+          <w:rFonts w:hint="default" w:ascii="Times New Roman" w:hAnsi="Times New Roman" w:cs="Times New Roman"/>
+        </w:rPr>
+      </w:pPr>
+    </w:p>
+    <w:p>
+      <w:pPr>
+        <w:pStyle w:val="37"/>
         <w:spacing w:line="240" w:lineRule="auto"/>
+        <w:jc w:val="both"/>
         <w:rPr>
           <w:rFonts w:hint="default" w:ascii="Times New Roman" w:hAnsi="Times New Roman" w:cs="Times New Roman"/>
         </w:rPr>
@@ -178,39 +188,39 @@
     </w:p>
     <w:p>
       <w:pPr>
-        <w:pStyle w:val="41"/>
+        <w:pStyle w:val="42"/>
         <w:spacing w:line="240" w:lineRule="auto"/>
-        <w:jc w:val="left"/>
-        <w:rPr>
-          <w:rFonts w:hint="default" w:ascii="Times New Roman" w:hAnsi="Times New Roman" w:cs="Times New Roman"/>
-        </w:rPr>
-      </w:pPr>
-    </w:p>
-    <w:p>
-      <w:pPr>
-        <w:pStyle w:val="41"/>
+        <w:jc w:val="both"/>
+        <w:rPr>
+          <w:rFonts w:hint="default" w:ascii="Times New Roman" w:hAnsi="Times New Roman" w:cs="Times New Roman"/>
+        </w:rPr>
+      </w:pPr>
+    </w:p>
+    <w:p>
+      <w:pPr>
+        <w:pStyle w:val="42"/>
         <w:spacing w:line="240" w:lineRule="auto"/>
-        <w:jc w:val="left"/>
-        <w:rPr>
-          <w:rFonts w:hint="default" w:ascii="Times New Roman" w:hAnsi="Times New Roman" w:cs="Times New Roman"/>
-        </w:rPr>
-      </w:pPr>
-    </w:p>
-    <w:p>
-      <w:pPr>
-        <w:pStyle w:val="41"/>
+        <w:jc w:val="both"/>
+        <w:rPr>
+          <w:rFonts w:hint="default" w:ascii="Times New Roman" w:hAnsi="Times New Roman" w:cs="Times New Roman"/>
+        </w:rPr>
+      </w:pPr>
+    </w:p>
+    <w:p>
+      <w:pPr>
+        <w:pStyle w:val="42"/>
         <w:spacing w:line="240" w:lineRule="auto"/>
-        <w:jc w:val="left"/>
-        <w:rPr>
-          <w:rFonts w:hint="default" w:ascii="Times New Roman" w:hAnsi="Times New Roman" w:cs="Times New Roman"/>
-        </w:rPr>
-      </w:pPr>
-    </w:p>
-    <w:p>
-      <w:pPr>
-        <w:pStyle w:val="41"/>
+        <w:jc w:val="both"/>
+        <w:rPr>
+          <w:rFonts w:hint="default" w:ascii="Times New Roman" w:hAnsi="Times New Roman" w:cs="Times New Roman"/>
+        </w:rPr>
+      </w:pPr>
+    </w:p>
+    <w:p>
+      <w:pPr>
+        <w:pStyle w:val="42"/>
         <w:spacing w:line="240" w:lineRule="auto"/>
-        <w:jc w:val="left"/>
+        <w:jc w:val="both"/>
         <w:rPr>
           <w:rFonts w:hint="default" w:ascii="Times New Roman" w:hAnsi="Times New Roman" w:cs="Times New Roman"/>
           <w:sz w:val="24"/>
@@ -238,9 +248,9 @@
     </w:p>
     <w:p>
       <w:pPr>
-        <w:pStyle w:val="41"/>
+        <w:pStyle w:val="42"/>
         <w:spacing w:line="240" w:lineRule="auto"/>
-        <w:jc w:val="left"/>
+        <w:jc w:val="both"/>
         <w:rPr>
           <w:rFonts w:hint="default" w:ascii="Times New Roman" w:hAnsi="Times New Roman" w:cs="Times New Roman"/>
           <w:sz w:val="24"/>
@@ -268,9 +278,9 @@
     </w:p>
     <w:p>
       <w:pPr>
-        <w:pStyle w:val="41"/>
+        <w:pStyle w:val="42"/>
         <w:spacing w:line="240" w:lineRule="auto"/>
-        <w:jc w:val="left"/>
+        <w:jc w:val="both"/>
         <w:rPr>
           <w:rFonts w:hint="default" w:ascii="Times New Roman" w:hAnsi="Times New Roman" w:cs="Times New Roman"/>
           <w:sz w:val="24"/>
@@ -301,9 +311,9 @@
     </w:p>
     <w:p>
       <w:pPr>
-        <w:pStyle w:val="41"/>
+        <w:pStyle w:val="42"/>
         <w:spacing w:line="240" w:lineRule="auto"/>
-        <w:jc w:val="left"/>
+        <w:jc w:val="both"/>
         <w:rPr>
           <w:rFonts w:hint="default" w:ascii="Times New Roman" w:hAnsi="Times New Roman" w:cs="Times New Roman"/>
           <w:sz w:val="24"/>
@@ -334,9 +344,9 @@
     </w:p>
     <w:p>
       <w:pPr>
-        <w:pStyle w:val="41"/>
+        <w:pStyle w:val="42"/>
         <w:spacing w:line="240" w:lineRule="auto"/>
-        <w:jc w:val="left"/>
+        <w:jc w:val="both"/>
         <w:rPr>
           <w:rFonts w:hint="default" w:ascii="Times New Roman" w:hAnsi="Times New Roman" w:cs="Times New Roman"/>
           <w:sz w:val="24"/>
@@ -367,9 +377,9 @@
     </w:p>
     <w:p>
       <w:pPr>
-        <w:pStyle w:val="41"/>
+        <w:pStyle w:val="42"/>
         <w:spacing w:line="240" w:lineRule="auto"/>
-        <w:jc w:val="left"/>
+        <w:jc w:val="both"/>
         <w:rPr>
           <w:rFonts w:hint="default" w:ascii="Times New Roman" w:hAnsi="Times New Roman" w:cs="Times New Roman"/>
           <w:sz w:val="24"/>
@@ -400,9 +410,9 @@
     </w:p>
     <w:p>
       <w:pPr>
-        <w:pStyle w:val="41"/>
+        <w:pStyle w:val="42"/>
         <w:spacing w:line="240" w:lineRule="auto"/>
-        <w:jc w:val="left"/>
+        <w:jc w:val="both"/>
         <w:rPr>
           <w:rFonts w:hint="default" w:ascii="Times New Roman" w:hAnsi="Times New Roman" w:cs="Times New Roman"/>
           <w:sz w:val="24"/>
@@ -433,9 +443,9 @@
     </w:p>
     <w:p>
       <w:pPr>
-        <w:pStyle w:val="41"/>
+        <w:pStyle w:val="42"/>
         <w:spacing w:line="240" w:lineRule="auto"/>
-        <w:jc w:val="left"/>
+        <w:jc w:val="both"/>
         <w:rPr>
           <w:rFonts w:hint="default" w:ascii="Times New Roman" w:hAnsi="Times New Roman" w:cs="Times New Roman"/>
           <w:sz w:val="24"/>
@@ -492,8 +502,9 @@
     </w:p>
     <w:p>
       <w:pPr>
-        <w:pStyle w:val="41"/>
+        <w:pStyle w:val="42"/>
         <w:spacing w:line="240" w:lineRule="auto"/>
+        <w:jc w:val="both"/>
         <w:rPr>
           <w:rFonts w:hint="default" w:ascii="Times New Roman" w:hAnsi="Times New Roman" w:cs="Times New Roman"/>
         </w:rPr>
@@ -504,6 +515,7 @@
         <w:pStyle w:val="2"/>
         <w:bidi w:val="0"/>
         <w:spacing w:line="240" w:lineRule="auto"/>
+        <w:jc w:val="both"/>
         <w:rPr>
           <w:rFonts w:hint="default" w:ascii="Times New Roman" w:hAnsi="Times New Roman" w:cs="Times New Roman"/>
           <w:color w:val="auto"/>
@@ -516,6 +528,7 @@
         <w:pStyle w:val="2"/>
         <w:bidi w:val="0"/>
         <w:spacing w:line="240" w:lineRule="auto"/>
+        <w:jc w:val="both"/>
         <w:rPr>
           <w:rFonts w:hint="default" w:ascii="Times New Roman" w:hAnsi="Times New Roman" w:cs="Times New Roman"/>
           <w:color w:val="005B5C"/>
@@ -533,7 +546,7 @@
     </w:p>
     <w:p>
       <w:pPr>
-        <w:pStyle w:val="41"/>
+        <w:pStyle w:val="42"/>
         <w:spacing w:line="240" w:lineRule="auto"/>
         <w:jc w:val="both"/>
         <w:rPr>
@@ -553,7 +566,7 @@
     </w:p>
     <w:p>
       <w:pPr>
-        <w:pStyle w:val="41"/>
+        <w:pStyle w:val="42"/>
         <w:spacing w:line="240" w:lineRule="auto"/>
         <w:jc w:val="both"/>
         <w:rPr>
@@ -565,7 +578,7 @@
     </w:p>
     <w:p>
       <w:pPr>
-        <w:pStyle w:val="41"/>
+        <w:pStyle w:val="42"/>
         <w:spacing w:line="240" w:lineRule="auto"/>
         <w:jc w:val="both"/>
         <w:rPr>
@@ -611,7 +624,7 @@
     </w:p>
     <w:p>
       <w:pPr>
-        <w:pStyle w:val="41"/>
+        <w:pStyle w:val="42"/>
         <w:spacing w:line="240" w:lineRule="auto"/>
         <w:jc w:val="both"/>
         <w:rPr>
@@ -623,7 +636,7 @@
     </w:p>
     <w:p>
       <w:pPr>
-        <w:pStyle w:val="41"/>
+        <w:pStyle w:val="42"/>
         <w:spacing w:line="240" w:lineRule="auto"/>
         <w:jc w:val="both"/>
         <w:rPr>
@@ -653,7 +666,7 @@
     </w:p>
     <w:p>
       <w:pPr>
-        <w:pStyle w:val="41"/>
+        <w:pStyle w:val="42"/>
         <w:spacing w:line="240" w:lineRule="auto"/>
         <w:jc w:val="both"/>
         <w:rPr>
@@ -663,7 +676,7 @@
     </w:p>
     <w:p>
       <w:pPr>
-        <w:pStyle w:val="41"/>
+        <w:pStyle w:val="42"/>
         <w:spacing w:line="240" w:lineRule="auto"/>
         <w:jc w:val="both"/>
         <w:rPr>
@@ -673,7 +686,7 @@
     </w:p>
     <w:p>
       <w:pPr>
-        <w:pStyle w:val="41"/>
+        <w:pStyle w:val="42"/>
         <w:spacing w:line="240" w:lineRule="auto"/>
         <w:jc w:val="both"/>
         <w:rPr>
@@ -683,7 +696,7 @@
     </w:p>
     <w:p>
       <w:pPr>
-        <w:pStyle w:val="41"/>
+        <w:pStyle w:val="42"/>
         <w:spacing w:line="240" w:lineRule="auto"/>
         <w:jc w:val="both"/>
         <w:rPr>
@@ -693,7 +706,7 @@
     </w:p>
     <w:p>
       <w:pPr>
-        <w:pStyle w:val="41"/>
+        <w:pStyle w:val="42"/>
         <w:spacing w:line="240" w:lineRule="auto"/>
         <w:jc w:val="both"/>
         <w:rPr>
@@ -703,7 +716,7 @@
     </w:p>
     <w:p>
       <w:pPr>
-        <w:pStyle w:val="41"/>
+        <w:pStyle w:val="42"/>
         <w:spacing w:line="240" w:lineRule="auto"/>
         <w:jc w:val="both"/>
         <w:rPr>
@@ -713,7 +726,7 @@
     </w:p>
     <w:p>
       <w:pPr>
-        <w:pStyle w:val="41"/>
+        <w:pStyle w:val="42"/>
         <w:spacing w:line="240" w:lineRule="auto"/>
         <w:jc w:val="both"/>
         <w:rPr>
@@ -723,7 +736,7 @@
     </w:p>
     <w:p>
       <w:pPr>
-        <w:pStyle w:val="41"/>
+        <w:pStyle w:val="42"/>
         <w:spacing w:line="240" w:lineRule="auto"/>
         <w:jc w:val="both"/>
         <w:rPr>
@@ -733,7 +746,7 @@
     </w:p>
     <w:p>
       <w:pPr>
-        <w:pStyle w:val="41"/>
+        <w:pStyle w:val="42"/>
         <w:spacing w:line="240" w:lineRule="auto"/>
         <w:jc w:val="both"/>
         <w:rPr>
@@ -743,7 +756,7 @@
     </w:p>
     <w:p>
       <w:pPr>
-        <w:pStyle w:val="41"/>
+        <w:pStyle w:val="42"/>
         <w:spacing w:line="240" w:lineRule="auto"/>
         <w:jc w:val="both"/>
         <w:rPr>
@@ -753,7 +766,7 @@
     </w:p>
     <w:p>
       <w:pPr>
-        <w:pStyle w:val="41"/>
+        <w:pStyle w:val="42"/>
         <w:spacing w:line="240" w:lineRule="auto"/>
         <w:jc w:val="both"/>
         <w:rPr>
@@ -763,7 +776,7 @@
     </w:p>
     <w:p>
       <w:pPr>
-        <w:pStyle w:val="41"/>
+        <w:pStyle w:val="42"/>
         <w:spacing w:line="240" w:lineRule="auto"/>
         <w:jc w:val="both"/>
         <w:rPr>
@@ -773,7 +786,7 @@
     </w:p>
     <w:p>
       <w:pPr>
-        <w:pStyle w:val="41"/>
+        <w:pStyle w:val="42"/>
         <w:spacing w:line="240" w:lineRule="auto"/>
         <w:jc w:val="both"/>
         <w:rPr>
@@ -783,7 +796,7 @@
     </w:p>
     <w:p>
       <w:pPr>
-        <w:pStyle w:val="41"/>
+        <w:pStyle w:val="42"/>
         <w:spacing w:line="240" w:lineRule="auto"/>
         <w:jc w:val="both"/>
         <w:rPr>
@@ -793,7 +806,7 @@
     </w:p>
     <w:p>
       <w:pPr>
-        <w:pStyle w:val="41"/>
+        <w:pStyle w:val="42"/>
         <w:spacing w:line="240" w:lineRule="auto"/>
         <w:jc w:val="both"/>
         <w:rPr>
@@ -803,7 +816,7 @@
     </w:p>
     <w:p>
       <w:pPr>
-        <w:pStyle w:val="41"/>
+        <w:pStyle w:val="42"/>
         <w:spacing w:line="240" w:lineRule="auto"/>
         <w:jc w:val="both"/>
         <w:rPr>
@@ -813,7 +826,7 @@
     </w:p>
     <w:p>
       <w:pPr>
-        <w:pStyle w:val="41"/>
+        <w:pStyle w:val="42"/>
         <w:spacing w:line="240" w:lineRule="auto"/>
         <w:jc w:val="both"/>
         <w:rPr>
@@ -823,7 +836,7 @@
     </w:p>
     <w:p>
       <w:pPr>
-        <w:pStyle w:val="41"/>
+        <w:pStyle w:val="42"/>
         <w:spacing w:line="240" w:lineRule="auto"/>
         <w:jc w:val="both"/>
         <w:rPr>
@@ -833,7 +846,7 @@
     </w:p>
     <w:p>
       <w:pPr>
-        <w:pStyle w:val="41"/>
+        <w:pStyle w:val="42"/>
         <w:spacing w:line="240" w:lineRule="auto"/>
         <w:jc w:val="both"/>
         <w:rPr>
@@ -843,7 +856,7 @@
     </w:p>
     <w:p>
       <w:pPr>
-        <w:pStyle w:val="41"/>
+        <w:pStyle w:val="42"/>
         <w:spacing w:line="240" w:lineRule="auto"/>
         <w:jc w:val="both"/>
         <w:rPr>
@@ -853,7 +866,7 @@
     </w:p>
     <w:p>
       <w:pPr>
-        <w:pStyle w:val="41"/>
+        <w:pStyle w:val="42"/>
         <w:spacing w:line="240" w:lineRule="auto"/>
         <w:jc w:val="both"/>
         <w:rPr>
@@ -863,80 +876,89 @@
     </w:p>
     <w:p>
       <w:pPr>
-        <w:pStyle w:val="41"/>
+        <w:pStyle w:val="42"/>
         <w:spacing w:line="240" w:lineRule="auto"/>
-        <w:rPr>
-          <w:rFonts w:hint="default" w:ascii="Times New Roman" w:hAnsi="Times New Roman" w:cs="Times New Roman"/>
-        </w:rPr>
-      </w:pPr>
-    </w:p>
-    <w:p>
-      <w:pPr>
-        <w:pStyle w:val="41"/>
+        <w:jc w:val="both"/>
+        <w:rPr>
+          <w:rFonts w:hint="default" w:ascii="Times New Roman" w:hAnsi="Times New Roman" w:cs="Times New Roman"/>
+        </w:rPr>
+      </w:pPr>
+    </w:p>
+    <w:p>
+      <w:pPr>
+        <w:pStyle w:val="42"/>
         <w:spacing w:line="240" w:lineRule="auto"/>
-        <w:rPr>
-          <w:rFonts w:hint="default" w:ascii="Times New Roman" w:hAnsi="Times New Roman" w:cs="Times New Roman"/>
-        </w:rPr>
-      </w:pPr>
-    </w:p>
-    <w:p>
-      <w:pPr>
-        <w:pStyle w:val="41"/>
+        <w:jc w:val="both"/>
+        <w:rPr>
+          <w:rFonts w:hint="default" w:ascii="Times New Roman" w:hAnsi="Times New Roman" w:cs="Times New Roman"/>
+        </w:rPr>
+      </w:pPr>
+    </w:p>
+    <w:p>
+      <w:pPr>
+        <w:pStyle w:val="42"/>
         <w:spacing w:line="240" w:lineRule="auto"/>
-        <w:rPr>
-          <w:rFonts w:hint="default" w:ascii="Times New Roman" w:hAnsi="Times New Roman" w:cs="Times New Roman"/>
-        </w:rPr>
-      </w:pPr>
-    </w:p>
-    <w:p>
-      <w:pPr>
-        <w:pStyle w:val="41"/>
+        <w:jc w:val="both"/>
+        <w:rPr>
+          <w:rFonts w:hint="default" w:ascii="Times New Roman" w:hAnsi="Times New Roman" w:cs="Times New Roman"/>
+        </w:rPr>
+      </w:pPr>
+    </w:p>
+    <w:p>
+      <w:pPr>
+        <w:pStyle w:val="42"/>
         <w:spacing w:line="240" w:lineRule="auto"/>
-        <w:rPr>
-          <w:rFonts w:hint="default" w:ascii="Times New Roman" w:hAnsi="Times New Roman" w:cs="Times New Roman"/>
-        </w:rPr>
-      </w:pPr>
-    </w:p>
-    <w:p>
-      <w:pPr>
-        <w:pStyle w:val="41"/>
+        <w:jc w:val="both"/>
+        <w:rPr>
+          <w:rFonts w:hint="default" w:ascii="Times New Roman" w:hAnsi="Times New Roman" w:cs="Times New Roman"/>
+        </w:rPr>
+      </w:pPr>
+    </w:p>
+    <w:p>
+      <w:pPr>
+        <w:pStyle w:val="42"/>
         <w:spacing w:line="240" w:lineRule="auto"/>
-        <w:rPr>
-          <w:rFonts w:hint="default" w:ascii="Times New Roman" w:hAnsi="Times New Roman" w:cs="Times New Roman"/>
-        </w:rPr>
-      </w:pPr>
-    </w:p>
-    <w:p>
-      <w:pPr>
-        <w:pStyle w:val="41"/>
+        <w:jc w:val="both"/>
+        <w:rPr>
+          <w:rFonts w:hint="default" w:ascii="Times New Roman" w:hAnsi="Times New Roman" w:cs="Times New Roman"/>
+        </w:rPr>
+      </w:pPr>
+    </w:p>
+    <w:p>
+      <w:pPr>
+        <w:pStyle w:val="42"/>
         <w:spacing w:line="240" w:lineRule="auto"/>
-        <w:rPr>
-          <w:rFonts w:hint="default" w:ascii="Times New Roman" w:hAnsi="Times New Roman" w:cs="Times New Roman"/>
-        </w:rPr>
-      </w:pPr>
-    </w:p>
-    <w:p>
-      <w:pPr>
-        <w:pStyle w:val="41"/>
+        <w:jc w:val="both"/>
+        <w:rPr>
+          <w:rFonts w:hint="default" w:ascii="Times New Roman" w:hAnsi="Times New Roman" w:cs="Times New Roman"/>
+        </w:rPr>
+      </w:pPr>
+    </w:p>
+    <w:p>
+      <w:pPr>
+        <w:pStyle w:val="42"/>
         <w:spacing w:line="240" w:lineRule="auto"/>
-        <w:rPr>
-          <w:rFonts w:hint="default" w:ascii="Times New Roman" w:hAnsi="Times New Roman" w:cs="Times New Roman"/>
-        </w:rPr>
-      </w:pPr>
-    </w:p>
-    <w:p>
-      <w:pPr>
-        <w:pStyle w:val="41"/>
+        <w:jc w:val="both"/>
+        <w:rPr>
+          <w:rFonts w:hint="default" w:ascii="Times New Roman" w:hAnsi="Times New Roman" w:cs="Times New Roman"/>
+        </w:rPr>
+      </w:pPr>
+    </w:p>
+    <w:p>
+      <w:pPr>
+        <w:pStyle w:val="42"/>
         <w:spacing w:line="240" w:lineRule="auto"/>
-        <w:rPr>
-          <w:rFonts w:hint="default" w:ascii="Times New Roman" w:hAnsi="Times New Roman" w:cs="Times New Roman"/>
-        </w:rPr>
-      </w:pPr>
-    </w:p>
-    <w:p>
-      <w:pPr>
-        <w:pStyle w:val="41"/>
+        <w:jc w:val="both"/>
+        <w:rPr>
+          <w:rFonts w:hint="default" w:ascii="Times New Roman" w:hAnsi="Times New Roman" w:cs="Times New Roman"/>
+        </w:rPr>
+      </w:pPr>
+    </w:p>
+    <w:p>
+      <w:pPr>
+        <w:pStyle w:val="42"/>
         <w:spacing w:line="240" w:lineRule="auto"/>
+        <w:jc w:val="both"/>
         <w:rPr>
           <w:rFonts w:hint="default" w:ascii="Times New Roman" w:hAnsi="Times New Roman" w:cs="Times New Roman"/>
         </w:rPr>
@@ -946,6 +968,7 @@
       <w:pPr>
         <w:pStyle w:val="2"/>
         <w:bidi w:val="0"/>
+        <w:jc w:val="both"/>
         <w:rPr>
           <w:rFonts w:hint="default" w:ascii="Times New Roman" w:hAnsi="Times New Roman" w:cs="Times New Roman"/>
         </w:rPr>
@@ -975,6 +998,7 @@
         <w:pStyle w:val="3"/>
         <w:bidi w:val="0"/>
         <w:ind w:left="440" w:leftChars="200" w:firstLine="0" w:firstLineChars="0"/>
+        <w:jc w:val="both"/>
         <w:rPr>
           <w:rFonts w:hint="default" w:ascii="Times New Roman" w:hAnsi="Times New Roman" w:cs="Times New Roman" w:eastAsiaTheme="majorEastAsia"/>
           <w:b/>
@@ -1104,6 +1128,7 @@
         <w:pStyle w:val="3"/>
         <w:bidi w:val="0"/>
         <w:ind w:left="440" w:leftChars="200" w:firstLine="0" w:firstLineChars="0"/>
+        <w:jc w:val="both"/>
         <w:rPr>
           <w:rFonts w:hint="default" w:cs="Times New Roman"/>
           <w:b/>
@@ -1379,6 +1404,7 @@
         <w:pStyle w:val="3"/>
         <w:bidi w:val="0"/>
         <w:ind w:left="440" w:leftChars="200" w:firstLine="0" w:firstLineChars="0"/>
+        <w:jc w:val="both"/>
         <w:rPr>
           <w:rFonts w:hint="default" w:cs="Times New Roman"/>
           <w:b/>
@@ -1510,18 +1536,7 @@
           <w:sz w:val="22"/>
           <w:szCs w:val="22"/>
         </w:rPr>
-        <w:t>Operational cost: Estimated at $3.00 to $5.00 per month under a serverless</w:t>
-      </w:r>
-      <w:bookmarkStart w:id="5" w:name="_GoBack"/>
-      <w:bookmarkEnd w:id="5"/>
-      <w:r>
-        <w:rPr>
-          <w:b w:val="0"/>
-          <w:bCs w:val="0"/>
-          <w:sz w:val="22"/>
-          <w:szCs w:val="22"/>
-        </w:rPr>
-        <w:t xml:space="preserve"> pay-as-you-go model (supporting approximately 2,000 queries per month via AWS Bedrock and Pinecone Free Tier) [6].</w:t>
+        <w:t>Operational cost: Estimated at $3.00 to $5.00 per month under a serverless pay-as-you-go model (supporting approximately 2,000 queries per month via AWS Bedrock and Pinecone Free Tier) [6].</w:t>
       </w:r>
     </w:p>
     <w:p>
@@ -1529,6 +1544,7 @@
         <w:pStyle w:val="3"/>
         <w:bidi w:val="0"/>
         <w:ind w:left="440" w:leftChars="200" w:firstLine="0" w:firstLineChars="0"/>
+        <w:jc w:val="both"/>
         <w:rPr>
           <w:rFonts w:hint="default" w:cs="Times New Roman"/>
           <w:b/>
@@ -1606,6 +1622,7 @@
           <w:numId w:val="5"/>
         </w:numPr>
         <w:bidi w:val="0"/>
+        <w:jc w:val="both"/>
         <w:rPr>
           <w:rFonts w:hint="default" w:ascii="Times New Roman" w:hAnsi="Times New Roman" w:cs="Times New Roman"/>
         </w:rPr>
@@ -1642,13 +1659,533 @@
         <w:jc w:val="both"/>
         <w:rPr>
           <w:rFonts w:hint="default" w:ascii="Times New Roman" w:hAnsi="Times New Roman" w:eastAsia="SimSun" w:cs="Times New Roman"/>
-          <w:b w:val="0"/>
-          <w:bCs w:val="0"/>
-          <w:sz w:val="22"/>
-          <w:szCs w:val="22"/>
-          <w:lang w:val="en-US" w:eastAsia="zh-CN"/>
-        </w:rPr>
-      </w:pPr>
+          <w:color w:val="auto"/>
+          <w:sz w:val="22"/>
+          <w:szCs w:val="22"/>
+        </w:rPr>
+      </w:pPr>
+      <w:r>
+        <w:rPr>
+          <w:rFonts w:hint="default" w:ascii="Times New Roman" w:hAnsi="Times New Roman" w:eastAsia="SimSun" w:cs="Times New Roman"/>
+          <w:color w:val="auto"/>
+          <w:sz w:val="22"/>
+          <w:szCs w:val="22"/>
+        </w:rPr>
+        <w:t>In the second section of the report, this part aims to identify the target user groups within the enterprise ecosystem and details their distinct operational characteristics, needs, and preferences. Based on accepted documents including the Project Charter and Project Proposal, the team has a deep understanding that addressing user behavior inside corporate communication channels is essential to designing an assistant that minimizes workflow friction while enforcing security boundaries.</w:t>
+      </w:r>
+    </w:p>
+    <w:p>
+      <w:pPr>
+        <w:pStyle w:val="3"/>
+        <w:bidi w:val="0"/>
+        <w:ind w:left="440" w:leftChars="200" w:firstLine="0" w:firstLineChars="0"/>
+        <w:jc w:val="both"/>
+        <w:rPr>
+          <w:rFonts w:hint="default" w:cs="Times New Roman"/>
+          <w:b/>
+          <w:caps w:val="0"/>
+          <w:lang w:val="en-US"/>
+        </w:rPr>
+      </w:pPr>
+      <w:r>
+        <w:rPr>
+          <w:rFonts w:hint="default" w:cs="Times New Roman"/>
+          <w:b/>
+          <w:caps w:val="0"/>
+          <w:lang w:val="en-US"/>
+        </w:rPr>
+        <w:t>2</w:t>
+      </w:r>
+      <w:r>
+        <w:rPr>
+          <w:rFonts w:hint="default" w:ascii="Times New Roman" w:hAnsi="Times New Roman" w:cs="Times New Roman"/>
+          <w:b/>
+          <w:caps w:val="0"/>
+          <w:lang w:val="en-US"/>
+        </w:rPr>
+        <w:t>.</w:t>
+      </w:r>
+      <w:r>
+        <w:rPr>
+          <w:rFonts w:hint="default" w:cs="Times New Roman"/>
+          <w:b/>
+          <w:caps w:val="0"/>
+          <w:lang w:val="en-US"/>
+        </w:rPr>
+        <w:t>1 Target User Personas and operational Roles</w:t>
+      </w:r>
+    </w:p>
+    <w:p>
+      <w:pPr>
+        <w:ind w:left="440" w:leftChars="200" w:firstLine="0" w:firstLineChars="0"/>
+        <w:jc w:val="both"/>
+        <w:rPr>
+          <w:rFonts w:hint="default" w:ascii="Times New Roman" w:hAnsi="Times New Roman" w:eastAsia="SimSun" w:cs="Times New Roman"/>
+          <w:b w:val="0"/>
+          <w:bCs/>
+          <w:color w:val="auto"/>
+          <w:sz w:val="22"/>
+          <w:szCs w:val="22"/>
+          <w:lang w:val="en-US"/>
+        </w:rPr>
+      </w:pPr>
+      <w:r>
+        <w:rPr>
+          <w:rFonts w:hint="default" w:ascii="Times New Roman" w:hAnsi="Times New Roman" w:cs="Times New Roman"/>
+          <w:b w:val="0"/>
+          <w:bCs/>
+          <w:caps w:val="0"/>
+          <w:color w:val="auto"/>
+          <w:sz w:val="22"/>
+          <w:szCs w:val="22"/>
+          <w:lang w:val="en-US"/>
+        </w:rPr>
+        <w:t xml:space="preserve">First, </w:t>
+      </w:r>
+      <w:r>
+        <w:rPr>
+          <w:rFonts w:hint="default" w:ascii="Times New Roman" w:hAnsi="Times New Roman" w:eastAsia="SimSun" w:cs="Times New Roman"/>
+          <w:b w:val="0"/>
+          <w:bCs/>
+          <w:color w:val="auto"/>
+          <w:sz w:val="22"/>
+          <w:szCs w:val="22"/>
+        </w:rPr>
+        <w:t>concerning user classification, the primary target audience inside the enterprise environment consists of two main user categories: general technical/operational employees and workspace administrators</w:t>
+      </w:r>
+      <w:r>
+        <w:rPr>
+          <w:rFonts w:hint="default" w:ascii="Times New Roman" w:hAnsi="Times New Roman" w:eastAsia="SimSun" w:cs="Times New Roman"/>
+          <w:b w:val="0"/>
+          <w:bCs/>
+          <w:color w:val="auto"/>
+          <w:sz w:val="22"/>
+          <w:szCs w:val="22"/>
+          <w:lang w:val="en-US"/>
+        </w:rPr>
+        <w:t>:</w:t>
+      </w:r>
+    </w:p>
+    <w:p>
+      <w:pPr>
+        <w:pStyle w:val="34"/>
+        <w:keepNext w:val="0"/>
+        <w:keepLines w:val="0"/>
+        <w:widowControl/>
+        <w:numPr>
+          <w:ilvl w:val="0"/>
+          <w:numId w:val="6"/>
+        </w:numPr>
+        <w:suppressLineNumbers w:val="0"/>
+        <w:tabs>
+          <w:tab w:val="clear" w:pos="420"/>
+        </w:tabs>
+        <w:ind w:left="1320" w:leftChars="0" w:hanging="420" w:firstLineChars="0"/>
+        <w:jc w:val="both"/>
+        <w:rPr>
+          <w:b w:val="0"/>
+          <w:bCs w:val="0"/>
+          <w:sz w:val="22"/>
+          <w:szCs w:val="22"/>
+        </w:rPr>
+      </w:pPr>
+      <w:r>
+        <w:rPr>
+          <w:b w:val="0"/>
+          <w:bCs w:val="0"/>
+          <w:sz w:val="22"/>
+          <w:szCs w:val="22"/>
+        </w:rPr>
+        <w:t>Specifically, Software Engineers, Product Managers, and Operational Staff: These end users represent the primary consumers of internal documentation. Consequently, their daily workflows require frequent access to technical guides, API documentation, architectural decisions, and standard operating procedures (SOPs) scattered across repositories like Confluence and GitHub. Furthermore, newly onboarded employees also fall into this category, thereby requiring rapid access to foundational project context without continuously interrupting senior team members.</w:t>
+      </w:r>
+    </w:p>
+    <w:p>
+      <w:pPr>
+        <w:pStyle w:val="34"/>
+        <w:keepNext w:val="0"/>
+        <w:keepLines w:val="0"/>
+        <w:widowControl/>
+        <w:numPr>
+          <w:ilvl w:val="0"/>
+          <w:numId w:val="6"/>
+        </w:numPr>
+        <w:suppressLineNumbers w:val="0"/>
+        <w:tabs>
+          <w:tab w:val="clear" w:pos="420"/>
+        </w:tabs>
+        <w:ind w:left="1320" w:leftChars="0" w:hanging="420" w:firstLineChars="0"/>
+        <w:jc w:val="both"/>
+        <w:rPr>
+          <w:rFonts w:hint="default" w:ascii="Times New Roman" w:hAnsi="Times New Roman" w:eastAsia="SimSun" w:cs="Times New Roman"/>
+          <w:b w:val="0"/>
+          <w:bCs w:val="0"/>
+          <w:color w:val="auto"/>
+          <w:sz w:val="22"/>
+          <w:szCs w:val="22"/>
+          <w:lang w:val="en-US"/>
+        </w:rPr>
+      </w:pPr>
+      <w:r>
+        <w:rPr>
+          <w:b w:val="0"/>
+          <w:bCs w:val="0"/>
+          <w:sz w:val="22"/>
+          <w:szCs w:val="22"/>
+        </w:rPr>
+        <w:t>In contrast, Knowledge Managers and Workspace Administrators: These secondary users oversee internal documentation maintenance and channel access management. In this context, their primary responsibility is ensuring that sensitive internal knowledge is accessible only within authorized channels without imposing complex administrative overhead</w:t>
+      </w:r>
+      <w:r>
+        <w:rPr>
+          <w:rFonts w:hint="default"/>
+          <w:b w:val="0"/>
+          <w:bCs w:val="0"/>
+          <w:sz w:val="22"/>
+          <w:szCs w:val="22"/>
+          <w:lang w:val="en-US"/>
+        </w:rPr>
+        <w:t>.</w:t>
+      </w:r>
+      <w:r>
+        <w:rPr>
+          <w:rFonts w:hint="eastAsia" w:ascii="SimSun" w:hAnsi="SimSun" w:eastAsia="SimSun" w:cs="SimSun"/>
+          <w:b w:val="0"/>
+          <w:bCs w:val="0"/>
+          <w:sz w:val="22"/>
+          <w:szCs w:val="22"/>
+        </w:rPr>
+        <w:t xml:space="preserve">  </w:t>
+      </w:r>
+    </w:p>
+    <w:p>
+      <w:pPr>
+        <w:pStyle w:val="3"/>
+        <w:bidi w:val="0"/>
+        <w:ind w:left="440" w:leftChars="200" w:firstLine="0" w:firstLineChars="0"/>
+        <w:jc w:val="both"/>
+        <w:rPr>
+          <w:rFonts w:hint="default" w:cs="Times New Roman"/>
+          <w:b/>
+          <w:caps w:val="0"/>
+          <w:lang w:val="en-US"/>
+        </w:rPr>
+      </w:pPr>
+      <w:r>
+        <w:rPr>
+          <w:rFonts w:hint="default" w:cs="Times New Roman"/>
+          <w:b/>
+          <w:caps w:val="0"/>
+          <w:lang w:val="en-US"/>
+        </w:rPr>
+        <w:t>2</w:t>
+      </w:r>
+      <w:r>
+        <w:rPr>
+          <w:rFonts w:hint="default" w:ascii="Times New Roman" w:hAnsi="Times New Roman" w:cs="Times New Roman"/>
+          <w:b/>
+          <w:caps w:val="0"/>
+          <w:lang w:val="en-US"/>
+        </w:rPr>
+        <w:t>.</w:t>
+      </w:r>
+      <w:r>
+        <w:rPr>
+          <w:rFonts w:hint="default" w:cs="Times New Roman"/>
+          <w:b/>
+          <w:caps w:val="0"/>
+          <w:lang w:val="en-US"/>
+        </w:rPr>
+        <w:t>2 User Pain Points and Behavioral Preferences</w:t>
+      </w:r>
+    </w:p>
+    <w:p>
+      <w:pPr>
+        <w:ind w:left="440" w:leftChars="200" w:firstLine="0" w:firstLineChars="0"/>
+        <w:jc w:val="both"/>
+        <w:rPr>
+          <w:rFonts w:hint="default" w:ascii="Times New Roman" w:hAnsi="Times New Roman" w:eastAsia="SimSun" w:cs="Times New Roman"/>
+          <w:b w:val="0"/>
+          <w:bCs w:val="0"/>
+          <w:color w:val="auto"/>
+          <w:sz w:val="22"/>
+          <w:szCs w:val="22"/>
+        </w:rPr>
+      </w:pPr>
+      <w:r>
+        <w:rPr>
+          <w:rFonts w:hint="default" w:ascii="Times New Roman" w:hAnsi="Times New Roman" w:eastAsia="SimSun" w:cs="Times New Roman"/>
+          <w:b w:val="0"/>
+          <w:bCs w:val="0"/>
+          <w:color w:val="auto"/>
+          <w:sz w:val="22"/>
+          <w:szCs w:val="22"/>
+        </w:rPr>
+        <w:t>Furthermore, analyzing daily workflow patterns and operational challenges, preliminary research conducted during the project proposal phase identified three primary user pain points:</w:t>
+      </w:r>
+    </w:p>
+    <w:p>
+      <w:pPr>
+        <w:pStyle w:val="34"/>
+        <w:keepNext w:val="0"/>
+        <w:keepLines w:val="0"/>
+        <w:widowControl/>
+        <w:numPr>
+          <w:ilvl w:val="0"/>
+          <w:numId w:val="7"/>
+        </w:numPr>
+        <w:suppressLineNumbers w:val="0"/>
+        <w:tabs>
+          <w:tab w:val="clear" w:pos="420"/>
+        </w:tabs>
+        <w:spacing w:before="0" w:beforeAutospacing="0" w:line="14" w:lineRule="atLeast"/>
+        <w:ind w:left="1320" w:leftChars="0" w:right="0" w:hanging="420" w:firstLineChars="0"/>
+        <w:jc w:val="both"/>
+        <w:rPr>
+          <w:rFonts w:hint="default" w:ascii="Times New Roman" w:hAnsi="Times New Roman" w:eastAsia="sans-serif" w:cs="Times New Roman"/>
+          <w:b w:val="0"/>
+          <w:bCs w:val="0"/>
+          <w:color w:val="auto"/>
+          <w:sz w:val="22"/>
+          <w:szCs w:val="22"/>
+        </w:rPr>
+      </w:pPr>
+      <w:r>
+        <w:rPr>
+          <w:rFonts w:hint="default" w:ascii="Times New Roman" w:hAnsi="Times New Roman" w:eastAsia="sans-serif" w:cs="Times New Roman"/>
+          <w:b w:val="0"/>
+          <w:bCs w:val="0"/>
+          <w:color w:val="auto"/>
+          <w:sz w:val="22"/>
+          <w:szCs w:val="22"/>
+          <w:lang w:val="en-US"/>
+        </w:rPr>
+        <w:t>F</w:t>
+      </w:r>
+      <w:r>
+        <w:rPr>
+          <w:rFonts w:hint="default" w:ascii="Times New Roman" w:hAnsi="Times New Roman" w:eastAsia="sans-serif" w:cs="Times New Roman"/>
+          <w:b w:val="0"/>
+          <w:bCs w:val="0"/>
+          <w:color w:val="auto"/>
+          <w:sz w:val="22"/>
+          <w:szCs w:val="22"/>
+        </w:rPr>
+        <w:t xml:space="preserve">irst, regarding context-switching fatigue: Employees express a strong preference for obtaining answers directly within their primary communication tool (Slack). Navigating away from ongoing team discussions to search through external web portals or complex Confluence space trees breaks cognitive focus and severely degrades productivity. </w:t>
+      </w:r>
+    </w:p>
+    <w:p>
+      <w:pPr>
+        <w:pStyle w:val="34"/>
+        <w:keepNext w:val="0"/>
+        <w:keepLines w:val="0"/>
+        <w:widowControl/>
+        <w:numPr>
+          <w:ilvl w:val="0"/>
+          <w:numId w:val="7"/>
+        </w:numPr>
+        <w:suppressLineNumbers w:val="0"/>
+        <w:tabs>
+          <w:tab w:val="clear" w:pos="420"/>
+        </w:tabs>
+        <w:spacing w:before="0" w:beforeAutospacing="0" w:line="14" w:lineRule="atLeast"/>
+        <w:ind w:left="1320" w:leftChars="0" w:right="0" w:hanging="420" w:firstLineChars="0"/>
+        <w:jc w:val="both"/>
+        <w:rPr>
+          <w:rFonts w:hint="default" w:ascii="Times New Roman" w:hAnsi="Times New Roman" w:eastAsia="sans-serif" w:cs="Times New Roman"/>
+          <w:b w:val="0"/>
+          <w:bCs w:val="0"/>
+          <w:color w:val="auto"/>
+          <w:sz w:val="22"/>
+          <w:szCs w:val="22"/>
+        </w:rPr>
+      </w:pPr>
+      <w:r>
+        <w:rPr>
+          <w:rFonts w:hint="default" w:ascii="Times New Roman" w:hAnsi="Times New Roman" w:eastAsia="sans-serif" w:cs="Times New Roman"/>
+          <w:b w:val="0"/>
+          <w:bCs w:val="0"/>
+          <w:color w:val="auto"/>
+          <w:sz w:val="22"/>
+          <w:szCs w:val="22"/>
+        </w:rPr>
+        <w:t xml:space="preserve">Second, concerning information retrieval latency: Finding verified answers across fragmented repositories currently requires significant manual search time. Users prefer natural language query interfaces that deliver immediate, summarized answers directly inside Slack threads rather than raw keyword search results. </w:t>
+      </w:r>
+    </w:p>
+    <w:p>
+      <w:pPr>
+        <w:pStyle w:val="34"/>
+        <w:keepNext w:val="0"/>
+        <w:keepLines w:val="0"/>
+        <w:widowControl/>
+        <w:numPr>
+          <w:ilvl w:val="0"/>
+          <w:numId w:val="7"/>
+        </w:numPr>
+        <w:suppressLineNumbers w:val="0"/>
+        <w:tabs>
+          <w:tab w:val="clear" w:pos="420"/>
+        </w:tabs>
+        <w:spacing w:before="0" w:beforeAutospacing="0" w:line="14" w:lineRule="atLeast"/>
+        <w:ind w:left="1320" w:leftChars="0" w:right="0" w:hanging="420" w:firstLineChars="0"/>
+        <w:jc w:val="both"/>
+        <w:rPr>
+          <w:rFonts w:hint="default" w:ascii="Times New Roman" w:hAnsi="Times New Roman" w:eastAsia="SimSun" w:cs="Times New Roman"/>
+          <w:color w:val="auto"/>
+          <w:sz w:val="22"/>
+          <w:szCs w:val="22"/>
+        </w:rPr>
+      </w:pPr>
+      <w:r>
+        <w:rPr>
+          <w:rFonts w:hint="default" w:ascii="Times New Roman" w:hAnsi="Times New Roman" w:eastAsia="sans-serif" w:cs="Times New Roman"/>
+          <w:b w:val="0"/>
+          <w:bCs w:val="0"/>
+          <w:color w:val="auto"/>
+          <w:sz w:val="22"/>
+          <w:szCs w:val="22"/>
+        </w:rPr>
+        <w:t>Finally, with respect to verification and trust requirements: End users exhibit low tolerance for unverified AI-generated responses. Their key preference is receiving synthesized answers accompanied by direct source citations (e.g., clickable links to specific Confluence pages or GitHub README files) to easily verify answer accuracy.</w:t>
+      </w:r>
+    </w:p>
+    <w:p>
+      <w:pPr>
+        <w:pStyle w:val="3"/>
+        <w:bidi w:val="0"/>
+        <w:ind w:left="440" w:leftChars="200" w:firstLine="0" w:firstLineChars="0"/>
+        <w:jc w:val="both"/>
+        <w:rPr>
+          <w:rFonts w:hint="default" w:cs="Times New Roman"/>
+          <w:b/>
+          <w:caps w:val="0"/>
+          <w:lang w:val="en-US"/>
+        </w:rPr>
+      </w:pPr>
+      <w:r>
+        <w:rPr>
+          <w:rFonts w:hint="default" w:cs="Times New Roman"/>
+          <w:b/>
+          <w:caps w:val="0"/>
+          <w:lang w:val="en-US"/>
+        </w:rPr>
+        <w:t>2</w:t>
+      </w:r>
+      <w:r>
+        <w:rPr>
+          <w:rFonts w:hint="default" w:ascii="Times New Roman" w:hAnsi="Times New Roman" w:cs="Times New Roman"/>
+          <w:b/>
+          <w:caps w:val="0"/>
+          <w:lang w:val="en-US"/>
+        </w:rPr>
+        <w:t>.</w:t>
+      </w:r>
+      <w:r>
+        <w:rPr>
+          <w:rFonts w:hint="default" w:cs="Times New Roman"/>
+          <w:b/>
+          <w:caps w:val="0"/>
+          <w:lang w:val="en-US"/>
+        </w:rPr>
+        <w:t>3 User Functional and Security Expectations</w:t>
+      </w:r>
+    </w:p>
+    <w:p>
+      <w:pPr>
+        <w:ind w:left="440" w:leftChars="200" w:firstLine="0" w:firstLineChars="0"/>
+        <w:jc w:val="both"/>
+        <w:rPr>
+          <w:rFonts w:hint="default" w:ascii="Times New Roman" w:hAnsi="Times New Roman" w:eastAsia="SimSun" w:cs="Times New Roman"/>
+          <w:color w:val="auto"/>
+          <w:sz w:val="22"/>
+          <w:szCs w:val="22"/>
+        </w:rPr>
+      </w:pPr>
+      <w:r>
+        <w:rPr>
+          <w:rFonts w:hint="default" w:ascii="Times New Roman" w:hAnsi="Times New Roman" w:eastAsia="SimSun" w:cs="Times New Roman"/>
+          <w:color w:val="auto"/>
+          <w:sz w:val="22"/>
+          <w:szCs w:val="22"/>
+        </w:rPr>
+        <w:t>Consequently, with regard to user functional and security expectations, requirements derived during the project charter phase establish clear operational boundaries:</w:t>
+      </w:r>
+    </w:p>
+    <w:p>
+      <w:pPr>
+        <w:pStyle w:val="34"/>
+        <w:keepNext w:val="0"/>
+        <w:keepLines w:val="0"/>
+        <w:widowControl/>
+        <w:numPr>
+          <w:ilvl w:val="0"/>
+          <w:numId w:val="8"/>
+        </w:numPr>
+        <w:suppressLineNumbers w:val="0"/>
+        <w:tabs>
+          <w:tab w:val="clear" w:pos="420"/>
+        </w:tabs>
+        <w:spacing w:before="0" w:beforeAutospacing="0" w:line="14" w:lineRule="atLeast"/>
+        <w:ind w:left="1320" w:leftChars="0" w:right="0" w:hanging="420" w:firstLineChars="0"/>
+        <w:jc w:val="both"/>
+        <w:rPr>
+          <w:rFonts w:hint="default" w:ascii="Times New Roman" w:hAnsi="Times New Roman" w:eastAsia="sans-serif" w:cs="Times New Roman"/>
+          <w:b w:val="0"/>
+          <w:bCs w:val="0"/>
+          <w:sz w:val="22"/>
+          <w:szCs w:val="22"/>
+        </w:rPr>
+      </w:pPr>
+      <w:r>
+        <w:rPr>
+          <w:rFonts w:hint="default" w:ascii="Times New Roman" w:hAnsi="Times New Roman" w:eastAsia="sans-serif" w:cs="Times New Roman"/>
+          <w:b w:val="0"/>
+          <w:bCs w:val="0"/>
+          <w:sz w:val="22"/>
+          <w:szCs w:val="22"/>
+        </w:rPr>
+        <w:t xml:space="preserve">Specifically, regarding thread-based conversational interaction: Users expect the bot to respond asynchronously within native Slack threads, preserving channel cleanliness and allowing team members to collaborate around the retrieved information. </w:t>
+      </w:r>
+    </w:p>
+    <w:p>
+      <w:pPr>
+        <w:pStyle w:val="34"/>
+        <w:keepNext w:val="0"/>
+        <w:keepLines w:val="0"/>
+        <w:widowControl/>
+        <w:numPr>
+          <w:ilvl w:val="0"/>
+          <w:numId w:val="8"/>
+        </w:numPr>
+        <w:suppressLineNumbers w:val="0"/>
+        <w:tabs>
+          <w:tab w:val="clear" w:pos="420"/>
+        </w:tabs>
+        <w:spacing w:before="0" w:beforeAutospacing="0" w:line="14" w:lineRule="atLeast"/>
+        <w:ind w:left="1320" w:leftChars="0" w:right="0" w:hanging="420" w:firstLineChars="0"/>
+        <w:jc w:val="both"/>
+        <w:rPr>
+          <w:rFonts w:hint="default"/>
+          <w:lang w:val="en-US"/>
+        </w:rPr>
+      </w:pPr>
+      <w:r>
+        <w:rPr>
+          <w:rFonts w:hint="default" w:ascii="Times New Roman" w:hAnsi="Times New Roman" w:eastAsia="sans-serif" w:cs="Times New Roman"/>
+          <w:b w:val="0"/>
+          <w:bCs w:val="0"/>
+          <w:sz w:val="22"/>
+          <w:szCs w:val="22"/>
+        </w:rPr>
+        <w:t>Additionally, concerning transparent access restriction: Users expect clear, non-intrusive feedback when attempting to query the assistant from non-whitelisted channels, ensuring enterprise security policies are transparently enforced without creating user confusion.</w:t>
+      </w:r>
+      <w:r>
+        <w:rPr>
+          <w:rFonts w:hint="default" w:ascii="Times New Roman" w:hAnsi="Times New Roman" w:eastAsia="SimSun" w:cs="Times New Roman"/>
+          <w:b w:val="0"/>
+          <w:bCs w:val="0"/>
+          <w:sz w:val="22"/>
+          <w:szCs w:val="22"/>
+        </w:rPr>
+        <w:t xml:space="preserve">  </w:t>
+      </w:r>
     </w:p>
     <w:p>
       <w:pPr>
@@ -1658,6 +2195,7 @@
           <w:numId w:val="5"/>
         </w:numPr>
         <w:bidi w:val="0"/>
+        <w:jc w:val="both"/>
         <w:rPr>
           <w:rFonts w:hint="default" w:ascii="Times New Roman" w:hAnsi="Times New Roman" w:cs="Times New Roman"/>
         </w:rPr>
@@ -1672,26 +2210,567 @@
     <w:p>
       <w:pPr>
         <w:spacing w:line="240" w:lineRule="auto"/>
-        <w:rPr>
-          <w:rFonts w:hint="default" w:ascii="Times New Roman" w:hAnsi="Times New Roman" w:cs="Times New Roman"/>
+        <w:jc w:val="both"/>
+        <w:rPr>
+          <w:rFonts w:hint="default" w:ascii="Times New Roman" w:hAnsi="Times New Roman" w:eastAsia="SimSun" w:cs="Times New Roman"/>
+          <w:color w:val="auto"/>
+          <w:sz w:val="22"/>
+          <w:szCs w:val="22"/>
+        </w:rPr>
+      </w:pPr>
+      <w:r>
+        <w:rPr>
+          <w:rFonts w:hint="default" w:ascii="Times New Roman" w:hAnsi="Times New Roman" w:eastAsia="SimSun" w:cs="Times New Roman"/>
+          <w:color w:val="auto"/>
+          <w:sz w:val="22"/>
+          <w:szCs w:val="22"/>
+        </w:rPr>
+        <w:t>Building upon the identified user needs and security expectations, this section conducts a systematic domain research on the technical architecture, component paradigms, and framework selections necessary to construct the enterprise assistant. Based on technical evaluations documented in the Project Charter and Project Proposal, the solution domain focuses on establishing a privacy-preserving, zero-cost Retrieval-Augmented Generation (RAG) system deployed locally.</w:t>
+      </w:r>
+    </w:p>
+    <w:p>
+      <w:pPr>
+        <w:pStyle w:val="3"/>
+        <w:bidi w:val="0"/>
+        <w:ind w:left="440" w:leftChars="200" w:firstLine="0" w:firstLineChars="0"/>
+        <w:jc w:val="both"/>
+        <w:rPr>
+          <w:rFonts w:hint="default" w:cs="Times New Roman"/>
+          <w:b/>
+          <w:caps w:val="0"/>
+          <w:lang w:val="en-US"/>
+        </w:rPr>
+      </w:pPr>
+      <w:r>
+        <w:rPr>
+          <w:rFonts w:hint="default" w:cs="Times New Roman"/>
+          <w:b/>
+          <w:caps w:val="0"/>
+          <w:lang w:val="en-US"/>
+        </w:rPr>
+        <w:t>3</w:t>
+      </w:r>
+      <w:r>
+        <w:rPr>
+          <w:rFonts w:hint="default" w:ascii="Times New Roman" w:hAnsi="Times New Roman" w:cs="Times New Roman"/>
+          <w:b/>
+          <w:caps w:val="0"/>
+          <w:lang w:val="en-US"/>
+        </w:rPr>
+        <w:t>.</w:t>
+      </w:r>
+      <w:r>
+        <w:rPr>
+          <w:rFonts w:hint="default" w:cs="Times New Roman"/>
+          <w:b/>
+          <w:caps w:val="0"/>
+          <w:lang w:val="en-US"/>
+        </w:rPr>
+        <w:t>1 Architecture Paradigm: Local-First RAG and Cloud APIs</w:t>
+      </w:r>
+    </w:p>
+    <w:p>
+      <w:pPr>
+        <w:pStyle w:val="34"/>
+        <w:keepNext w:val="0"/>
+        <w:keepLines w:val="0"/>
+        <w:widowControl/>
+        <w:suppressLineNumbers w:val="0"/>
+        <w:ind w:left="440" w:leftChars="200" w:firstLine="0" w:firstLineChars="0"/>
+        <w:jc w:val="both"/>
+      </w:pPr>
+      <w:r>
+        <w:t>In terms of deployment options, most chat assistants rely on cloud services like OpenAI or Anthropic. However, using cloud services brings two big issues for our project: high monthly costs and security risks from sending private documents over the internet.</w:t>
+      </w:r>
+    </w:p>
+    <w:p>
+      <w:pPr>
+        <w:pStyle w:val="34"/>
+        <w:keepNext w:val="0"/>
+        <w:keepLines w:val="0"/>
+        <w:widowControl/>
+        <w:numPr>
+          <w:ilvl w:val="0"/>
+          <w:numId w:val="9"/>
+        </w:numPr>
+        <w:suppressLineNumbers w:val="0"/>
+        <w:tabs>
+          <w:tab w:val="clear" w:pos="420"/>
+        </w:tabs>
+        <w:ind w:left="1320" w:leftChars="0" w:hanging="420" w:firstLineChars="0"/>
+        <w:jc w:val="both"/>
+        <w:rPr>
+          <w:b w:val="0"/>
+          <w:bCs w:val="0"/>
+        </w:rPr>
+      </w:pPr>
+      <w:r>
+        <w:rPr>
+          <w:b w:val="0"/>
+          <w:bCs w:val="0"/>
+        </w:rPr>
+        <w:t>Specifically, regarding data privacy: Keeping company files safe is a top priority. Consequently, running everything on our own machines ensures that all document data stays on local disks, completely removing any risk of data leaks.</w:t>
+      </w:r>
+    </w:p>
+    <w:p>
+      <w:pPr>
+        <w:pStyle w:val="34"/>
+        <w:keepNext w:val="0"/>
+        <w:keepLines w:val="0"/>
+        <w:widowControl/>
+        <w:numPr>
+          <w:ilvl w:val="0"/>
+          <w:numId w:val="9"/>
+        </w:numPr>
+        <w:suppressLineNumbers w:val="0"/>
+        <w:tabs>
+          <w:tab w:val="clear" w:pos="420"/>
+        </w:tabs>
+        <w:ind w:left="1320" w:leftChars="0" w:hanging="420" w:firstLineChars="0"/>
+        <w:jc w:val="both"/>
+        <w:rPr>
+          <w:b w:val="0"/>
+          <w:bCs w:val="0"/>
+        </w:rPr>
+      </w:pPr>
+      <w:r>
+        <w:rPr>
+          <w:b w:val="0"/>
+          <w:bCs w:val="0"/>
+        </w:rPr>
+        <w:t>Furthermore, concerning cost: Our project has a strict zero dollar budget during the proof of concept phase. Therefore, using local open source models gives us good results without paying any cloud API fees.</w:t>
+      </w:r>
+    </w:p>
+    <w:p>
+      <w:pPr>
+        <w:pStyle w:val="3"/>
+        <w:bidi w:val="0"/>
+        <w:ind w:left="440" w:leftChars="200" w:firstLine="0" w:firstLineChars="0"/>
+        <w:jc w:val="both"/>
+        <w:rPr>
+          <w:rFonts w:hint="default" w:cs="Times New Roman"/>
+          <w:b/>
+          <w:caps w:val="0"/>
+          <w:lang w:val="en-US"/>
+        </w:rPr>
+      </w:pPr>
+      <w:r>
+        <w:rPr>
+          <w:rFonts w:hint="default" w:cs="Times New Roman"/>
+          <w:b/>
+          <w:caps w:val="0"/>
+          <w:lang w:val="en-US"/>
+        </w:rPr>
+        <w:t>3</w:t>
+      </w:r>
+      <w:r>
+        <w:rPr>
+          <w:rFonts w:hint="default" w:ascii="Times New Roman" w:hAnsi="Times New Roman" w:cs="Times New Roman"/>
+          <w:b/>
+          <w:caps w:val="0"/>
+          <w:lang w:val="en-US"/>
+        </w:rPr>
+        <w:t>.</w:t>
+      </w:r>
+      <w:r>
+        <w:rPr>
+          <w:rFonts w:hint="default" w:cs="Times New Roman"/>
+          <w:b/>
+          <w:caps w:val="0"/>
+          <w:lang w:val="en-US"/>
+        </w:rPr>
+        <w:t>2 Local AI Inference and Embedding Selection</w:t>
+      </w:r>
+    </w:p>
+    <w:p>
+      <w:pPr>
+        <w:ind w:left="440" w:leftChars="200" w:firstLine="0" w:firstLineChars="0"/>
+        <w:jc w:val="both"/>
+        <w:rPr>
+          <w:rFonts w:hint="default" w:ascii="Times New Roman" w:hAnsi="Times New Roman" w:eastAsia="SimSun" w:cs="Times New Roman"/>
+          <w:b w:val="0"/>
+          <w:bCs w:val="0"/>
+          <w:color w:val="auto"/>
+          <w:sz w:val="22"/>
+          <w:szCs w:val="22"/>
+          <w:lang w:val="en-US"/>
+        </w:rPr>
+      </w:pPr>
+      <w:r>
+        <w:rPr>
+          <w:rFonts w:hint="default" w:ascii="Times New Roman" w:hAnsi="Times New Roman" w:eastAsia="SimSun" w:cs="Times New Roman"/>
+          <w:b w:val="0"/>
+          <w:bCs w:val="0"/>
+          <w:color w:val="auto"/>
+          <w:sz w:val="22"/>
+          <w:szCs w:val="22"/>
+        </w:rPr>
+        <w:t>Next, with regard to the model execution runtime, to run open source language models on our own computers, we need a lightweight tool that can handle the workload efficiently</w:t>
+      </w:r>
+      <w:r>
+        <w:rPr>
+          <w:rFonts w:hint="default" w:ascii="Times New Roman" w:hAnsi="Times New Roman" w:eastAsia="SimSun" w:cs="Times New Roman"/>
+          <w:b w:val="0"/>
+          <w:bCs w:val="0"/>
+          <w:color w:val="auto"/>
+          <w:sz w:val="22"/>
+          <w:szCs w:val="22"/>
+          <w:lang w:val="en-US"/>
+        </w:rPr>
+        <w:t>:</w:t>
+      </w:r>
+    </w:p>
+    <w:p>
+      <w:pPr>
+        <w:pStyle w:val="34"/>
+        <w:keepNext w:val="0"/>
+        <w:keepLines w:val="0"/>
+        <w:widowControl/>
+        <w:numPr>
+          <w:ilvl w:val="0"/>
+          <w:numId w:val="10"/>
+        </w:numPr>
+        <w:suppressLineNumbers w:val="0"/>
+        <w:tabs>
+          <w:tab w:val="clear" w:pos="420"/>
+        </w:tabs>
+        <w:ind w:left="1320" w:leftChars="0" w:hanging="420" w:firstLineChars="0"/>
+        <w:jc w:val="both"/>
+        <w:rPr>
+          <w:b w:val="0"/>
+          <w:bCs w:val="0"/>
+        </w:rPr>
+      </w:pPr>
+      <w:r>
+        <w:rPr>
+          <w:b w:val="0"/>
+          <w:bCs w:val="0"/>
+        </w:rPr>
+        <w:t>First, for the language model: We chose Ollama. Specifically, it works smoothly on different operating systems, offers simple local API endpoints, and runs models like Llama 3 or Mistral very well without needing expensive cloud graphics cards.</w:t>
+      </w:r>
+    </w:p>
+    <w:p>
+      <w:pPr>
+        <w:pStyle w:val="34"/>
+        <w:keepNext w:val="0"/>
+        <w:keepLines w:val="0"/>
+        <w:widowControl/>
+        <w:numPr>
+          <w:ilvl w:val="0"/>
+          <w:numId w:val="10"/>
+        </w:numPr>
+        <w:suppressLineNumbers w:val="0"/>
+        <w:tabs>
+          <w:tab w:val="clear" w:pos="420"/>
+        </w:tabs>
+        <w:ind w:left="1320" w:leftChars="0" w:hanging="420" w:firstLineChars="0"/>
+        <w:jc w:val="both"/>
+        <w:rPr>
+          <w:rFonts w:hint="default" w:ascii="Times New Roman" w:hAnsi="Times New Roman" w:eastAsia="SimSun" w:cs="Times New Roman"/>
+          <w:b w:val="0"/>
+          <w:bCs w:val="0"/>
+          <w:color w:val="auto"/>
+          <w:sz w:val="22"/>
+          <w:szCs w:val="22"/>
+          <w:lang w:val="en-US"/>
+        </w:rPr>
+      </w:pPr>
+      <w:r>
+        <w:rPr>
+          <w:b w:val="0"/>
+          <w:bCs w:val="0"/>
+        </w:rPr>
+        <w:t>Second, for text embeddings: Which turn text chunks into searchable vectors, we use models like nomic embed text or bge small. In this context, they are accurate and lightweight, allowing them to run alongside the main model easily.</w:t>
+      </w:r>
+      <w:r>
+        <w:rPr>
+          <w:rFonts w:hint="eastAsia" w:ascii="SimSun" w:hAnsi="SimSun" w:eastAsia="SimSun" w:cs="SimSun"/>
+          <w:b w:val="0"/>
+          <w:bCs w:val="0"/>
+          <w:sz w:val="24"/>
+        </w:rPr>
+        <w:t xml:space="preserve">  </w:t>
+      </w:r>
+    </w:p>
+    <w:p>
+      <w:pPr>
+        <w:pStyle w:val="3"/>
+        <w:bidi w:val="0"/>
+        <w:ind w:left="440" w:leftChars="200" w:firstLine="0" w:firstLineChars="0"/>
+        <w:jc w:val="both"/>
+        <w:rPr>
+          <w:rFonts w:hint="default" w:cs="Times New Roman"/>
+          <w:b/>
+          <w:caps w:val="0"/>
+          <w:lang w:val="en-US"/>
+        </w:rPr>
+      </w:pPr>
+      <w:r>
+        <w:rPr>
+          <w:rFonts w:hint="default" w:cs="Times New Roman"/>
+          <w:b/>
+          <w:caps w:val="0"/>
+          <w:lang w:val="en-US"/>
+        </w:rPr>
+        <w:t>3</w:t>
+      </w:r>
+      <w:r>
+        <w:rPr>
+          <w:rFonts w:hint="default" w:ascii="Times New Roman" w:hAnsi="Times New Roman" w:cs="Times New Roman"/>
+          <w:b/>
+          <w:caps w:val="0"/>
+          <w:lang w:val="en-US"/>
+        </w:rPr>
+        <w:t>.</w:t>
+      </w:r>
+      <w:r>
+        <w:rPr>
+          <w:rFonts w:hint="default" w:cs="Times New Roman"/>
+          <w:b/>
+          <w:caps w:val="0"/>
+          <w:lang w:val="en-US"/>
+        </w:rPr>
+        <w:t>3 Vector Database Sele</w:t>
+      </w:r>
+      <w:bookmarkStart w:id="5" w:name="_GoBack"/>
+      <w:bookmarkEnd w:id="5"/>
+      <w:r>
+        <w:rPr>
+          <w:rFonts w:hint="default" w:cs="Times New Roman"/>
+          <w:b/>
+          <w:caps w:val="0"/>
+          <w:lang w:val="en-US"/>
+        </w:rPr>
+        <w:t>ction</w:t>
+      </w:r>
+    </w:p>
+    <w:p>
+      <w:pPr>
+        <w:ind w:left="440" w:leftChars="200" w:firstLine="0" w:firstLineChars="0"/>
+        <w:jc w:val="both"/>
+        <w:rPr>
+          <w:rFonts w:hint="default" w:ascii="Times New Roman" w:hAnsi="Times New Roman" w:eastAsia="SimSun" w:cs="Times New Roman"/>
+          <w:color w:val="auto"/>
+          <w:sz w:val="22"/>
+          <w:szCs w:val="22"/>
+          <w:lang w:val="en-US"/>
+        </w:rPr>
+      </w:pPr>
+      <w:r>
+        <w:rPr>
+          <w:rFonts w:hint="default" w:ascii="Times New Roman" w:hAnsi="Times New Roman" w:eastAsia="SimSun" w:cs="Times New Roman"/>
+          <w:color w:val="auto"/>
+          <w:sz w:val="22"/>
+          <w:szCs w:val="22"/>
+        </w:rPr>
+        <w:t>Furthermore, analyzing vector storage solutions, vector databases act as the core search engine for finding relevant documents</w:t>
+      </w:r>
+      <w:r>
+        <w:rPr>
+          <w:rFonts w:hint="default" w:ascii="Times New Roman" w:hAnsi="Times New Roman" w:eastAsia="SimSun" w:cs="Times New Roman"/>
+          <w:color w:val="auto"/>
+          <w:sz w:val="22"/>
+          <w:szCs w:val="22"/>
+          <w:lang w:val="en-US"/>
+        </w:rPr>
+        <w:t>:</w:t>
+      </w:r>
+    </w:p>
+    <w:p>
+      <w:pPr>
+        <w:pStyle w:val="34"/>
+        <w:keepNext w:val="0"/>
+        <w:keepLines w:val="0"/>
+        <w:widowControl/>
+        <w:numPr>
+          <w:ilvl w:val="0"/>
+          <w:numId w:val="11"/>
+        </w:numPr>
+        <w:suppressLineNumbers w:val="0"/>
+        <w:tabs>
+          <w:tab w:val="clear" w:pos="420"/>
+        </w:tabs>
+        <w:ind w:left="1320" w:leftChars="0" w:hanging="420" w:firstLineChars="0"/>
+        <w:jc w:val="both"/>
+        <w:rPr>
+          <w:b w:val="0"/>
+          <w:bCs w:val="0"/>
+        </w:rPr>
+      </w:pPr>
+      <w:r>
+        <w:rPr>
+          <w:b w:val="0"/>
+          <w:bCs w:val="0"/>
+        </w:rPr>
+        <w:t>In contrast to cloud vector services: Services like Pinecone or Milvus add setup overhead and costs.</w:t>
+      </w:r>
+    </w:p>
+    <w:p>
+      <w:pPr>
+        <w:pStyle w:val="34"/>
+        <w:keepNext w:val="0"/>
+        <w:keepLines w:val="0"/>
+        <w:widowControl/>
+        <w:numPr>
+          <w:ilvl w:val="0"/>
+          <w:numId w:val="11"/>
+        </w:numPr>
+        <w:suppressLineNumbers w:val="0"/>
+        <w:tabs>
+          <w:tab w:val="clear" w:pos="420"/>
+        </w:tabs>
+        <w:ind w:left="1320" w:leftChars="0" w:hanging="420" w:firstLineChars="0"/>
+        <w:jc w:val="both"/>
+        <w:rPr>
+          <w:rFonts w:hint="default" w:ascii="Times New Roman" w:hAnsi="Times New Roman" w:eastAsia="SimSun" w:cs="Times New Roman"/>
+          <w:b w:val="0"/>
+          <w:bCs w:val="0"/>
+          <w:color w:val="auto"/>
+          <w:sz w:val="22"/>
+          <w:szCs w:val="22"/>
+          <w:lang w:val="en-US"/>
+        </w:rPr>
+      </w:pPr>
+      <w:r>
+        <w:rPr>
+          <w:b w:val="0"/>
+          <w:bCs w:val="0"/>
+        </w:rPr>
+        <w:t>Consequently, we chose ChromaDB: ChromaDB runs directly inside the Python environment and saves data locally on the hard drive. As a result, this avoids managing a separate database server and gives us fast search results for free.</w:t>
+      </w:r>
+    </w:p>
+    <w:p>
+      <w:pPr>
+        <w:pStyle w:val="3"/>
+        <w:bidi w:val="0"/>
+        <w:ind w:left="440" w:leftChars="200" w:firstLine="0" w:firstLineChars="0"/>
+        <w:jc w:val="both"/>
+        <w:rPr>
+          <w:rFonts w:hint="default" w:cs="Times New Roman"/>
+          <w:b/>
+          <w:caps w:val="0"/>
+          <w:lang w:val="en-US"/>
+        </w:rPr>
+      </w:pPr>
+      <w:r>
+        <w:rPr>
+          <w:rFonts w:hint="default" w:cs="Times New Roman"/>
+          <w:b/>
+          <w:caps w:val="0"/>
+          <w:lang w:val="en-US"/>
+        </w:rPr>
+        <w:t>3</w:t>
+      </w:r>
+      <w:r>
+        <w:rPr>
+          <w:rFonts w:hint="default" w:ascii="Times New Roman" w:hAnsi="Times New Roman" w:cs="Times New Roman"/>
+          <w:b/>
+          <w:caps w:val="0"/>
+          <w:lang w:val="en-US"/>
+        </w:rPr>
+        <w:t>.</w:t>
+      </w:r>
+      <w:r>
+        <w:rPr>
+          <w:rFonts w:hint="default" w:cs="Times New Roman"/>
+          <w:b/>
+          <w:caps w:val="0"/>
+          <w:lang w:val="en-US"/>
+        </w:rPr>
+        <w:t>4 Communication Interface and Network Connectivity</w:t>
+      </w:r>
+    </w:p>
+    <w:p>
+      <w:pPr>
+        <w:pStyle w:val="34"/>
+        <w:keepNext w:val="0"/>
+        <w:keepLines w:val="0"/>
+        <w:widowControl/>
+        <w:suppressLineNumbers w:val="0"/>
+        <w:ind w:left="440" w:leftChars="200" w:firstLine="0" w:firstLineChars="0"/>
+        <w:jc w:val="both"/>
+        <w:rPr>
+          <w:b w:val="0"/>
+          <w:bCs w:val="0"/>
+          <w:sz w:val="22"/>
+          <w:szCs w:val="22"/>
+        </w:rPr>
+      </w:pPr>
+      <w:r>
+        <w:rPr>
+          <w:b w:val="0"/>
+          <w:bCs w:val="0"/>
+          <w:sz w:val="22"/>
+          <w:szCs w:val="22"/>
+        </w:rPr>
+        <w:t>Finally, connecting Slack to the local application requires a secure setup that does not expose internal network endpoints.</w:t>
+      </w:r>
+    </w:p>
+    <w:p>
+      <w:pPr>
+        <w:pStyle w:val="34"/>
+        <w:keepNext w:val="0"/>
+        <w:keepLines w:val="0"/>
+        <w:widowControl/>
+        <w:numPr>
+          <w:ilvl w:val="0"/>
+          <w:numId w:val="12"/>
+        </w:numPr>
+        <w:suppressLineNumbers w:val="0"/>
+        <w:tabs>
+          <w:tab w:val="clear" w:pos="420"/>
+        </w:tabs>
+        <w:ind w:left="1320" w:leftChars="0" w:hanging="420" w:firstLineChars="0"/>
+        <w:jc w:val="both"/>
+        <w:rPr>
+          <w:b w:val="0"/>
+          <w:bCs w:val="0"/>
+          <w:sz w:val="22"/>
+          <w:szCs w:val="22"/>
+        </w:rPr>
+      </w:pPr>
+      <w:r>
+        <w:rPr>
+          <w:b w:val="0"/>
+          <w:bCs w:val="0"/>
+          <w:sz w:val="22"/>
+          <w:szCs w:val="22"/>
+        </w:rPr>
+        <w:t>Specifically, regarding traditional webhooks: Standard Slack HTTP event subscriptions require a public web address, which usually means paying for cloud hosting or using reverse tunneling utilities like Ngrok.</w:t>
+      </w:r>
+    </w:p>
+    <w:p>
+      <w:pPr>
+        <w:pStyle w:val="34"/>
+        <w:keepNext w:val="0"/>
+        <w:keepLines w:val="0"/>
+        <w:widowControl/>
+        <w:numPr>
+          <w:ilvl w:val="0"/>
+          <w:numId w:val="12"/>
+        </w:numPr>
+        <w:suppressLineNumbers w:val="0"/>
+        <w:tabs>
+          <w:tab w:val="clear" w:pos="420"/>
+        </w:tabs>
+        <w:ind w:left="1320" w:leftChars="0" w:hanging="420" w:firstLineChars="0"/>
+        <w:jc w:val="both"/>
+        <w:rPr>
+          <w:rFonts w:hint="default" w:ascii="Times New Roman" w:hAnsi="Times New Roman" w:eastAsia="SimSun" w:cs="Times New Roman"/>
+          <w:color w:val="auto"/>
+          <w:sz w:val="22"/>
+          <w:szCs w:val="22"/>
           <w:lang w:val="en-AU"/>
         </w:rPr>
       </w:pPr>
       <w:r>
         <w:rPr>
-          <w:rFonts w:hint="default" w:ascii="Times New Roman" w:hAnsi="Times New Roman" w:cs="Times New Roman"/>
-          <w:lang w:val="en-AU"/>
-        </w:rPr>
-        <w:t>[</w:t>
-      </w:r>
-      <w:r>
-        <w:rPr>
-          <w:rFonts w:hint="default" w:ascii="Times New Roman" w:hAnsi="Times New Roman" w:cs="Times New Roman"/>
-          <w:i/>
-          <w:iCs/>
-          <w:lang w:val="en-AU"/>
-        </w:rPr>
-        <w:t xml:space="preserve">In this part of the report, outline and detail the research that has been undertaken to understand the potential technological platforms and programming languages, sensors and so on. A critical analysis is needed to understand the most appropriate technical architecture of the system, along with suggestions of architecture, platform, tool, programming language, devices, sensors etc. (as appropriate for the project).] </w:t>
+          <w:b w:val="0"/>
+          <w:bCs w:val="0"/>
+          <w:sz w:val="22"/>
+          <w:szCs w:val="22"/>
+        </w:rPr>
+        <w:t>Alternatively, leveraging Slack Socket Mode: Utilizing Slack Socket Mode establishes a secure connection from the local Python application out to Slack servers using WebSockets. Thereby, the application receives incoming queries over outbound connections without opening inbound public ports or needing a public IP address</w:t>
       </w:r>
     </w:p>
     <w:p>
@@ -1702,6 +2781,7 @@
           <w:numId w:val="5"/>
         </w:numPr>
         <w:bidi w:val="0"/>
+        <w:jc w:val="both"/>
         <w:rPr>
           <w:rFonts w:hint="default" w:ascii="Times New Roman" w:hAnsi="Times New Roman" w:cs="Times New Roman"/>
         </w:rPr>
@@ -1716,29 +2796,427 @@
     <w:p>
       <w:pPr>
         <w:spacing w:line="240" w:lineRule="auto"/>
-        <w:rPr>
-          <w:rFonts w:hint="default" w:ascii="Times New Roman" w:hAnsi="Times New Roman" w:cs="Times New Roman"/>
-        </w:rPr>
-      </w:pPr>
-      <w:r>
-        <w:rPr>
-          <w:rFonts w:hint="default" w:ascii="Times New Roman" w:hAnsi="Times New Roman" w:cs="Times New Roman"/>
-        </w:rPr>
-        <w:t>[</w:t>
-      </w:r>
-      <w:r>
-        <w:rPr>
-          <w:rFonts w:hint="default" w:ascii="Times New Roman" w:hAnsi="Times New Roman" w:cs="Times New Roman"/>
-          <w:i/>
-          <w:iCs/>
-        </w:rPr>
-        <w:t>Present a mapping of knowledge, skill and technology requirements of the selected architecture design to what you have as a final year student. Clearly indicate any gap that may exist and a plan to overcome it</w:t>
-      </w:r>
-      <w:r>
-        <w:rPr>
-          <w:rFonts w:hint="default" w:ascii="Times New Roman" w:hAnsi="Times New Roman" w:cs="Times New Roman"/>
-        </w:rPr>
-        <w:t>. Students may need to discuss potential gaps (individual limitations) with their team and see if the team can help overcome them.]</w:t>
+        <w:jc w:val="both"/>
+        <w:rPr>
+          <w:rFonts w:hint="default" w:ascii="Times New Roman" w:hAnsi="Times New Roman" w:eastAsia="SimSun" w:cs="Times New Roman"/>
+          <w:color w:val="auto"/>
+          <w:sz w:val="22"/>
+          <w:szCs w:val="22"/>
+        </w:rPr>
+      </w:pPr>
+      <w:r>
+        <w:rPr>
+          <w:rFonts w:hint="default" w:ascii="Times New Roman" w:hAnsi="Times New Roman" w:eastAsia="SimSun" w:cs="Times New Roman"/>
+          <w:color w:val="auto"/>
+          <w:sz w:val="22"/>
+          <w:szCs w:val="22"/>
+        </w:rPr>
+        <w:t>First and foremost, mapping the knowledge, skill, and technology requirements of the selected architecture design against the current capabilities of final year students is essential. Specifically, this section evaluates the technical readiness of the team, identifies existing gaps, and outlines a collaborative plan to overcome individual limitations through team support.</w:t>
+      </w:r>
+    </w:p>
+    <w:p>
+      <w:pPr>
+        <w:pStyle w:val="3"/>
+        <w:bidi w:val="0"/>
+        <w:ind w:left="440" w:leftChars="200" w:firstLine="0" w:firstLineChars="0"/>
+        <w:jc w:val="both"/>
+        <w:rPr>
+          <w:rFonts w:hint="default" w:cs="Times New Roman"/>
+          <w:b/>
+          <w:caps w:val="0"/>
+          <w:lang w:val="en-US"/>
+        </w:rPr>
+      </w:pPr>
+      <w:r>
+        <w:rPr>
+          <w:rFonts w:hint="default" w:cs="Times New Roman"/>
+          <w:b/>
+          <w:caps w:val="0"/>
+          <w:lang w:val="en-US"/>
+        </w:rPr>
+        <w:t>4</w:t>
+      </w:r>
+      <w:r>
+        <w:rPr>
+          <w:rFonts w:hint="default" w:ascii="Times New Roman" w:hAnsi="Times New Roman" w:cs="Times New Roman"/>
+          <w:b/>
+          <w:caps w:val="0"/>
+          <w:lang w:val="en-US"/>
+        </w:rPr>
+        <w:t>.</w:t>
+      </w:r>
+      <w:r>
+        <w:rPr>
+          <w:rFonts w:hint="default" w:cs="Times New Roman"/>
+          <w:b/>
+          <w:caps w:val="0"/>
+          <w:lang w:val="en-US"/>
+        </w:rPr>
+        <w:t>1 Knowledge and Skill Baseline of Final Year Students</w:t>
+      </w:r>
+    </w:p>
+    <w:p>
+      <w:pPr>
+        <w:pStyle w:val="34"/>
+        <w:keepNext w:val="0"/>
+        <w:keepLines w:val="0"/>
+        <w:widowControl/>
+        <w:suppressLineNumbers w:val="0"/>
+        <w:ind w:left="440" w:leftChars="200" w:firstLine="0" w:firstLineChars="0"/>
+        <w:jc w:val="both"/>
+      </w:pPr>
+      <w:r>
+        <w:t>In terms of foundational knowledge and core competencies, final year software engineering students possess a solid academic background.</w:t>
+      </w:r>
+    </w:p>
+    <w:p>
+      <w:pPr>
+        <w:pStyle w:val="34"/>
+        <w:keepNext w:val="0"/>
+        <w:keepLines w:val="0"/>
+        <w:widowControl/>
+        <w:numPr>
+          <w:ilvl w:val="0"/>
+          <w:numId w:val="13"/>
+        </w:numPr>
+        <w:suppressLineNumbers w:val="0"/>
+        <w:tabs>
+          <w:tab w:val="clear" w:pos="420"/>
+        </w:tabs>
+        <w:ind w:left="1320" w:leftChars="0" w:hanging="420" w:firstLineChars="0"/>
+        <w:jc w:val="both"/>
+        <w:rPr>
+          <w:b w:val="0"/>
+          <w:bCs w:val="0"/>
+          <w:color w:val="auto"/>
+          <w:sz w:val="22"/>
+          <w:szCs w:val="22"/>
+        </w:rPr>
+      </w:pPr>
+      <w:r>
+        <w:rPr>
+          <w:b w:val="0"/>
+          <w:bCs w:val="0"/>
+          <w:color w:val="auto"/>
+          <w:sz w:val="22"/>
+          <w:szCs w:val="22"/>
+        </w:rPr>
+        <w:t>Specifically, regarding programming and software concepts: The team brings strong experience in Python development, modular software design, and database fundamentals acquired through coursework and previous university projects.</w:t>
+      </w:r>
+    </w:p>
+    <w:p>
+      <w:pPr>
+        <w:pStyle w:val="34"/>
+        <w:keepNext w:val="0"/>
+        <w:keepLines w:val="0"/>
+        <w:widowControl/>
+        <w:numPr>
+          <w:ilvl w:val="0"/>
+          <w:numId w:val="13"/>
+        </w:numPr>
+        <w:suppressLineNumbers w:val="0"/>
+        <w:tabs>
+          <w:tab w:val="clear" w:pos="420"/>
+        </w:tabs>
+        <w:ind w:left="1320" w:leftChars="0" w:hanging="420" w:firstLineChars="0"/>
+        <w:jc w:val="both"/>
+        <w:rPr>
+          <w:b w:val="0"/>
+          <w:bCs w:val="0"/>
+          <w:color w:val="auto"/>
+          <w:sz w:val="22"/>
+          <w:szCs w:val="22"/>
+        </w:rPr>
+      </w:pPr>
+      <w:r>
+        <w:rPr>
+          <w:b w:val="0"/>
+          <w:bCs w:val="0"/>
+          <w:color w:val="auto"/>
+          <w:sz w:val="22"/>
+          <w:szCs w:val="22"/>
+        </w:rPr>
+        <w:t>Furthermore, concerning collaboration practices: Proficiency in version control workflows and task management ensures structured teamwork and clear role distribution.</w:t>
+      </w:r>
+    </w:p>
+    <w:p>
+      <w:pPr>
+        <w:pStyle w:val="3"/>
+        <w:bidi w:val="0"/>
+        <w:ind w:left="440" w:leftChars="200" w:firstLine="0" w:firstLineChars="0"/>
+        <w:jc w:val="both"/>
+        <w:rPr>
+          <w:rFonts w:hint="default" w:cs="Times New Roman"/>
+          <w:b/>
+          <w:caps w:val="0"/>
+          <w:lang w:val="en-US"/>
+        </w:rPr>
+      </w:pPr>
+      <w:r>
+        <w:rPr>
+          <w:rFonts w:hint="default" w:cs="Times New Roman"/>
+          <w:b/>
+          <w:caps w:val="0"/>
+          <w:lang w:val="en-US"/>
+        </w:rPr>
+        <w:t>4</w:t>
+      </w:r>
+      <w:r>
+        <w:rPr>
+          <w:rFonts w:hint="default" w:ascii="Times New Roman" w:hAnsi="Times New Roman" w:cs="Times New Roman"/>
+          <w:b/>
+          <w:caps w:val="0"/>
+          <w:lang w:val="en-US"/>
+        </w:rPr>
+        <w:t>.</w:t>
+      </w:r>
+      <w:r>
+        <w:rPr>
+          <w:rFonts w:hint="default" w:cs="Times New Roman"/>
+          <w:b/>
+          <w:caps w:val="0"/>
+          <w:lang w:val="en-US"/>
+        </w:rPr>
+        <w:t>2 Technology Requirements and Gap Identification</w:t>
+      </w:r>
+    </w:p>
+    <w:p>
+      <w:pPr>
+        <w:pStyle w:val="34"/>
+        <w:keepNext w:val="0"/>
+        <w:keepLines w:val="0"/>
+        <w:widowControl/>
+        <w:suppressLineNumbers w:val="0"/>
+        <w:ind w:left="440" w:leftChars="200" w:firstLine="0" w:firstLineChars="0"/>
+        <w:jc w:val="both"/>
+        <w:rPr>
+          <w:b w:val="0"/>
+          <w:bCs w:val="0"/>
+        </w:rPr>
+      </w:pPr>
+      <w:r>
+        <w:rPr>
+          <w:b w:val="0"/>
+          <w:bCs w:val="0"/>
+        </w:rPr>
+        <w:t>However, analyzing the specific technical stack of the local Retrieval Augmented Generation architecture reveals several individual limitations and gaps.</w:t>
+      </w:r>
+    </w:p>
+    <w:p>
+      <w:pPr>
+        <w:pStyle w:val="34"/>
+        <w:keepNext w:val="0"/>
+        <w:keepLines w:val="0"/>
+        <w:widowControl/>
+        <w:numPr>
+          <w:ilvl w:val="0"/>
+          <w:numId w:val="14"/>
+        </w:numPr>
+        <w:suppressLineNumbers w:val="0"/>
+        <w:tabs>
+          <w:tab w:val="clear" w:pos="420"/>
+        </w:tabs>
+        <w:ind w:left="1320" w:leftChars="0" w:hanging="420" w:firstLineChars="0"/>
+        <w:jc w:val="both"/>
+        <w:rPr>
+          <w:b w:val="0"/>
+          <w:bCs w:val="0"/>
+        </w:rPr>
+      </w:pPr>
+      <w:r>
+        <w:rPr>
+          <w:b w:val="0"/>
+          <w:bCs w:val="0"/>
+        </w:rPr>
+        <w:t>First, concerning vector database technologies: While students understand traditional relational databases, managing embedded vector stores like ChromaDB and implementing similarity search algorithms represent an initial technology gap.</w:t>
+      </w:r>
+    </w:p>
+    <w:p>
+      <w:pPr>
+        <w:pStyle w:val="34"/>
+        <w:keepNext w:val="0"/>
+        <w:keepLines w:val="0"/>
+        <w:widowControl/>
+        <w:numPr>
+          <w:ilvl w:val="0"/>
+          <w:numId w:val="14"/>
+        </w:numPr>
+        <w:suppressLineNumbers w:val="0"/>
+        <w:tabs>
+          <w:tab w:val="clear" w:pos="420"/>
+        </w:tabs>
+        <w:ind w:left="1320" w:leftChars="0" w:hanging="420" w:firstLineChars="0"/>
+        <w:jc w:val="both"/>
+        <w:rPr>
+          <w:b w:val="0"/>
+          <w:bCs w:val="0"/>
+        </w:rPr>
+      </w:pPr>
+      <w:r>
+        <w:rPr>
+          <w:b w:val="0"/>
+          <w:bCs w:val="0"/>
+        </w:rPr>
+        <w:t>Second, regarding asynchronous communication tools: Building real time event listeners using the Slack Bolt SDK over persistent WebSocket connections requires new practical skills beyond standard web request handling.</w:t>
+      </w:r>
+    </w:p>
+    <w:p>
+      <w:pPr>
+        <w:pStyle w:val="34"/>
+        <w:keepNext w:val="0"/>
+        <w:keepLines w:val="0"/>
+        <w:widowControl/>
+        <w:numPr>
+          <w:ilvl w:val="0"/>
+          <w:numId w:val="14"/>
+        </w:numPr>
+        <w:suppressLineNumbers w:val="0"/>
+        <w:tabs>
+          <w:tab w:val="clear" w:pos="420"/>
+        </w:tabs>
+        <w:ind w:left="1320" w:leftChars="0" w:hanging="420" w:firstLineChars="0"/>
+        <w:jc w:val="both"/>
+        <w:rPr>
+          <w:rFonts w:hint="default"/>
+          <w:b w:val="0"/>
+          <w:bCs w:val="0"/>
+          <w:lang w:val="en-US"/>
+        </w:rPr>
+      </w:pPr>
+      <w:r>
+        <w:rPr>
+          <w:b w:val="0"/>
+          <w:bCs w:val="0"/>
+        </w:rPr>
+        <w:t>Third, with respect to local AI runtimes: Configuring Ollama and managing resource allocation for local language models on developer workstations introduces a learning curve.</w:t>
+      </w:r>
+    </w:p>
+    <w:p>
+      <w:pPr>
+        <w:pStyle w:val="3"/>
+        <w:bidi w:val="0"/>
+        <w:ind w:left="440" w:leftChars="200" w:firstLine="0" w:firstLineChars="0"/>
+        <w:jc w:val="both"/>
+        <w:rPr>
+          <w:rFonts w:hint="default" w:cs="Times New Roman"/>
+          <w:b/>
+          <w:caps w:val="0"/>
+          <w:lang w:val="en-US"/>
+        </w:rPr>
+      </w:pPr>
+      <w:r>
+        <w:rPr>
+          <w:rFonts w:hint="default" w:cs="Times New Roman"/>
+          <w:b/>
+          <w:caps w:val="0"/>
+          <w:lang w:val="en-US"/>
+        </w:rPr>
+        <w:t>4</w:t>
+      </w:r>
+      <w:r>
+        <w:rPr>
+          <w:rFonts w:hint="default" w:ascii="Times New Roman" w:hAnsi="Times New Roman" w:cs="Times New Roman"/>
+          <w:b/>
+          <w:caps w:val="0"/>
+          <w:lang w:val="en-US"/>
+        </w:rPr>
+        <w:t>.</w:t>
+      </w:r>
+      <w:r>
+        <w:rPr>
+          <w:rFonts w:hint="default" w:cs="Times New Roman"/>
+          <w:b/>
+          <w:caps w:val="0"/>
+          <w:lang w:val="en-US"/>
+        </w:rPr>
+        <w:t>3 Team Collaboration and Mitigation Plan</w:t>
+      </w:r>
+    </w:p>
+    <w:p>
+      <w:pPr>
+        <w:pStyle w:val="34"/>
+        <w:keepNext w:val="0"/>
+        <w:keepLines w:val="0"/>
+        <w:widowControl/>
+        <w:suppressLineNumbers w:val="0"/>
+        <w:ind w:left="440" w:leftChars="200" w:firstLine="0" w:firstLineChars="0"/>
+        <w:jc w:val="both"/>
+        <w:rPr>
+          <w:b w:val="0"/>
+          <w:bCs w:val="0"/>
+          <w:color w:val="auto"/>
+        </w:rPr>
+      </w:pPr>
+      <w:r>
+        <w:rPr>
+          <w:b w:val="0"/>
+          <w:bCs w:val="0"/>
+          <w:color w:val="auto"/>
+        </w:rPr>
+        <w:t>Consequently, to bridge these gaps and overcome individual limitations, the team has established a structured support plan.</w:t>
+      </w:r>
+    </w:p>
+    <w:p>
+      <w:pPr>
+        <w:pStyle w:val="34"/>
+        <w:keepNext w:val="0"/>
+        <w:keepLines w:val="0"/>
+        <w:widowControl/>
+        <w:numPr>
+          <w:ilvl w:val="0"/>
+          <w:numId w:val="14"/>
+        </w:numPr>
+        <w:suppressLineNumbers w:val="0"/>
+        <w:tabs>
+          <w:tab w:val="clear" w:pos="420"/>
+        </w:tabs>
+        <w:ind w:left="1320" w:leftChars="0" w:hanging="420" w:firstLineChars="0"/>
+        <w:jc w:val="both"/>
+        <w:rPr>
+          <w:b w:val="0"/>
+          <w:bCs w:val="0"/>
+          <w:color w:val="auto"/>
+        </w:rPr>
+      </w:pPr>
+      <w:r>
+        <w:rPr>
+          <w:b w:val="0"/>
+          <w:bCs w:val="0"/>
+          <w:color w:val="auto"/>
+        </w:rPr>
+        <w:t>Specifically, regarding peer learning: Team members with stronger backend experience lead knowledge sharing sessions to guide others on asynchronous programming and WebSocket integration.</w:t>
+      </w:r>
+    </w:p>
+    <w:p>
+      <w:pPr>
+        <w:pStyle w:val="34"/>
+        <w:keepNext w:val="0"/>
+        <w:keepLines w:val="0"/>
+        <w:widowControl/>
+        <w:numPr>
+          <w:ilvl w:val="0"/>
+          <w:numId w:val="14"/>
+        </w:numPr>
+        <w:suppressLineNumbers w:val="0"/>
+        <w:tabs>
+          <w:tab w:val="clear" w:pos="420"/>
+        </w:tabs>
+        <w:ind w:left="1320" w:leftChars="0" w:hanging="420" w:firstLineChars="0"/>
+        <w:jc w:val="both"/>
+        <w:rPr>
+          <w:rFonts w:hint="default" w:ascii="Times New Roman" w:hAnsi="Times New Roman" w:eastAsia="SimSun" w:cs="Times New Roman"/>
+          <w:color w:val="auto"/>
+          <w:sz w:val="22"/>
+          <w:szCs w:val="22"/>
+        </w:rPr>
+      </w:pPr>
+      <w:r>
+        <w:rPr>
+          <w:b w:val="0"/>
+          <w:bCs w:val="0"/>
+          <w:color w:val="auto"/>
+        </w:rPr>
+        <w:t>Furthermore, regarding task rebalancing: The team distributes development duties based on individual strengths during regular meetings, ensuring that any technical blocker is resolved collectively without impacting project deadlines.</w:t>
       </w:r>
     </w:p>
     <w:p>
@@ -1749,6 +3227,7 @@
           <w:numId w:val="5"/>
         </w:numPr>
         <w:bidi w:val="0"/>
+        <w:jc w:val="both"/>
         <w:rPr>
           <w:rFonts w:hint="default" w:ascii="Times New Roman" w:hAnsi="Times New Roman" w:cs="Times New Roman"/>
         </w:rPr>
@@ -1762,60 +3241,981 @@
     </w:p>
     <w:p>
       <w:pPr>
+        <w:pStyle w:val="34"/>
+        <w:keepNext w:val="0"/>
+        <w:keepLines w:val="0"/>
+        <w:widowControl/>
+        <w:suppressLineNumbers w:val="0"/>
+        <w:jc w:val="both"/>
+      </w:pPr>
+      <w:r>
+        <w:t>In order to ensure legal compliance and maintain user trust, this project adheres to established ethical frameworks and statutory data protection requirements. Specifically, because the enterprise assistant processes internal organizational knowledge and handles user interactions within Slack, system design must strictly comply with Australian privacy laws and international AI governance standards.</w:t>
+      </w:r>
+      <w:r>
+        <w:rPr>
+          <w:rFonts w:hint="default"/>
+          <w:lang w:val="en-US"/>
+        </w:rPr>
+        <w:t xml:space="preserve"> </w:t>
+      </w:r>
+      <w:r>
+        <w:t xml:space="preserve">Consequently, </w:t>
+      </w:r>
+      <w:r>
+        <w:rPr>
+          <w:rFonts w:hint="default"/>
+          <w:lang w:val="en-US"/>
+        </w:rPr>
+        <w:t>the following</w:t>
+      </w:r>
+      <w:r>
+        <w:t xml:space="preserve"> details the applicable regulatory frameworks, their core requirements, and the corresponding technical safeguards implemented in this project.</w:t>
+      </w:r>
+    </w:p>
+    <w:tbl>
+      <w:tblPr>
+        <w:tblStyle w:val="38"/>
+        <w:tblW w:w="0" w:type="auto"/>
+        <w:tblInd w:w="0" w:type="dxa"/>
+        <w:tblBorders>
+          <w:top w:val="single" w:color="auto" w:sz="4" w:space="0"/>
+          <w:left w:val="single" w:color="auto" w:sz="4" w:space="0"/>
+          <w:bottom w:val="single" w:color="auto" w:sz="4" w:space="0"/>
+          <w:right w:val="single" w:color="auto" w:sz="4" w:space="0"/>
+          <w:insideH w:val="single" w:color="auto" w:sz="4" w:space="0"/>
+          <w:insideV w:val="single" w:color="auto" w:sz="4" w:space="0"/>
+        </w:tblBorders>
+        <w:tblLayout w:type="autofit"/>
+        <w:tblCellMar>
+          <w:top w:w="0" w:type="dxa"/>
+          <w:left w:w="108" w:type="dxa"/>
+          <w:bottom w:w="0" w:type="dxa"/>
+          <w:right w:w="108" w:type="dxa"/>
+        </w:tblCellMar>
+      </w:tblPr>
+      <w:tblGrid>
+        <w:gridCol w:w="2952"/>
+        <w:gridCol w:w="2952"/>
+        <w:gridCol w:w="2952"/>
+      </w:tblGrid>
+      <w:tr>
+        <w:tblPrEx>
+          <w:tblBorders>
+            <w:top w:val="single" w:color="auto" w:sz="4" w:space="0"/>
+            <w:left w:val="single" w:color="auto" w:sz="4" w:space="0"/>
+            <w:bottom w:val="single" w:color="auto" w:sz="4" w:space="0"/>
+            <w:right w:val="single" w:color="auto" w:sz="4" w:space="0"/>
+            <w:insideH w:val="single" w:color="auto" w:sz="4" w:space="0"/>
+            <w:insideV w:val="single" w:color="auto" w:sz="4" w:space="0"/>
+          </w:tblBorders>
+          <w:tblCellMar>
+            <w:top w:w="0" w:type="dxa"/>
+            <w:left w:w="108" w:type="dxa"/>
+            <w:bottom w:w="0" w:type="dxa"/>
+            <w:right w:w="108" w:type="dxa"/>
+          </w:tblCellMar>
+        </w:tblPrEx>
+        <w:tc>
+          <w:tcPr>
+            <w:tcW w:w="2952" w:type="dxa"/>
+            <w:vAlign w:val="center"/>
+          </w:tcPr>
+          <w:p>
+            <w:pPr>
+              <w:spacing w:line="240" w:lineRule="auto"/>
+              <w:jc w:val="both"/>
+              <w:rPr>
+                <w:rFonts w:hint="default" w:ascii="Times New Roman" w:hAnsi="Times New Roman" w:cs="Times New Roman"/>
+                <w:b/>
+                <w:bCs/>
+                <w:color w:val="auto"/>
+                <w:vertAlign w:val="baseline"/>
+                <w:lang w:val="en-US"/>
+              </w:rPr>
+            </w:pPr>
+            <w:r>
+              <w:rPr>
+                <w:rFonts w:hint="default" w:ascii="Times New Roman" w:hAnsi="Times New Roman" w:cs="Times New Roman"/>
+                <w:b/>
+                <w:bCs/>
+                <w:color w:val="auto"/>
+                <w:vertAlign w:val="baseline"/>
+                <w:lang w:val="en-US"/>
+              </w:rPr>
+              <w:t>Regulation (Standard)</w:t>
+            </w:r>
+          </w:p>
+        </w:tc>
+        <w:tc>
+          <w:tcPr>
+            <w:tcW w:w="2952" w:type="dxa"/>
+            <w:vAlign w:val="center"/>
+          </w:tcPr>
+          <w:p>
+            <w:pPr>
+              <w:spacing w:line="240" w:lineRule="auto"/>
+              <w:jc w:val="both"/>
+              <w:rPr>
+                <w:rFonts w:hint="default" w:ascii="Times New Roman" w:hAnsi="Times New Roman" w:cs="Times New Roman"/>
+                <w:b/>
+                <w:bCs/>
+                <w:color w:val="auto"/>
+                <w:vertAlign w:val="baseline"/>
+                <w:lang w:val="en-US"/>
+              </w:rPr>
+            </w:pPr>
+            <w:r>
+              <w:rPr>
+                <w:rFonts w:hint="default" w:ascii="Times New Roman" w:hAnsi="Times New Roman" w:cs="Times New Roman"/>
+                <w:b/>
+                <w:bCs/>
+                <w:color w:val="auto"/>
+                <w:vertAlign w:val="baseline"/>
+                <w:lang w:val="en-US"/>
+              </w:rPr>
+              <w:t>Core Requirement</w:t>
+            </w:r>
+          </w:p>
+        </w:tc>
+        <w:tc>
+          <w:tcPr>
+            <w:tcW w:w="2952" w:type="dxa"/>
+            <w:vAlign w:val="center"/>
+          </w:tcPr>
+          <w:p>
+            <w:pPr>
+              <w:spacing w:line="240" w:lineRule="auto"/>
+              <w:jc w:val="both"/>
+              <w:rPr>
+                <w:rFonts w:hint="default" w:ascii="Times New Roman" w:hAnsi="Times New Roman" w:cs="Times New Roman"/>
+                <w:b/>
+                <w:bCs/>
+                <w:color w:val="auto"/>
+                <w:vertAlign w:val="baseline"/>
+                <w:lang w:val="en-US"/>
+              </w:rPr>
+            </w:pPr>
+            <w:r>
+              <w:rPr>
+                <w:rFonts w:hint="default" w:ascii="Times New Roman" w:hAnsi="Times New Roman" w:cs="Times New Roman"/>
+                <w:b/>
+                <w:bCs/>
+                <w:color w:val="auto"/>
+                <w:vertAlign w:val="baseline"/>
+                <w:lang w:val="en-US"/>
+              </w:rPr>
+              <w:t>Technical Implementation Safeguard</w:t>
+            </w:r>
+          </w:p>
+        </w:tc>
+      </w:tr>
+      <w:tr>
+        <w:tblPrEx>
+          <w:tblBorders>
+            <w:top w:val="single" w:color="auto" w:sz="4" w:space="0"/>
+            <w:left w:val="single" w:color="auto" w:sz="4" w:space="0"/>
+            <w:bottom w:val="single" w:color="auto" w:sz="4" w:space="0"/>
+            <w:right w:val="single" w:color="auto" w:sz="4" w:space="0"/>
+            <w:insideH w:val="single" w:color="auto" w:sz="4" w:space="0"/>
+            <w:insideV w:val="single" w:color="auto" w:sz="4" w:space="0"/>
+          </w:tblBorders>
+          <w:tblCellMar>
+            <w:top w:w="0" w:type="dxa"/>
+            <w:left w:w="108" w:type="dxa"/>
+            <w:bottom w:w="0" w:type="dxa"/>
+            <w:right w:w="108" w:type="dxa"/>
+          </w:tblCellMar>
+        </w:tblPrEx>
+        <w:tc>
+          <w:tcPr>
+            <w:tcW w:w="2952" w:type="dxa"/>
+            <w:vAlign w:val="center"/>
+          </w:tcPr>
+          <w:p>
+            <w:pPr>
+              <w:spacing w:line="240" w:lineRule="auto"/>
+              <w:jc w:val="both"/>
+              <w:rPr>
+                <w:rFonts w:hint="default" w:ascii="Times New Roman" w:hAnsi="Times New Roman" w:cs="Times New Roman"/>
+                <w:color w:val="auto"/>
+                <w:vertAlign w:val="baseline"/>
+                <w:lang w:val="en-US"/>
+              </w:rPr>
+            </w:pPr>
+            <w:r>
+              <w:rPr>
+                <w:rFonts w:hint="default" w:ascii="Times New Roman" w:hAnsi="Times New Roman" w:eastAsia="SimSun" w:cs="Times New Roman"/>
+                <w:b w:val="0"/>
+                <w:bCs w:val="0"/>
+                <w:i w:val="0"/>
+                <w:iCs w:val="0"/>
+                <w:color w:val="auto"/>
+                <w:sz w:val="22"/>
+                <w:szCs w:val="22"/>
+              </w:rPr>
+              <w:t>Australian Privacy Principle 6 (Use or disclosure of personal information)</w:t>
+            </w:r>
+          </w:p>
+        </w:tc>
+        <w:tc>
+          <w:tcPr>
+            <w:tcW w:w="2952" w:type="dxa"/>
+            <w:vAlign w:val="center"/>
+          </w:tcPr>
+          <w:p>
+            <w:pPr>
+              <w:spacing w:line="240" w:lineRule="auto"/>
+              <w:jc w:val="both"/>
+              <w:rPr>
+                <w:rFonts w:hint="default" w:ascii="Times New Roman" w:hAnsi="Times New Roman" w:cs="Times New Roman"/>
+                <w:color w:val="auto"/>
+                <w:sz w:val="22"/>
+                <w:szCs w:val="22"/>
+                <w:vertAlign w:val="baseline"/>
+              </w:rPr>
+            </w:pPr>
+            <w:r>
+              <w:rPr>
+                <w:rFonts w:hint="default" w:ascii="Times New Roman" w:hAnsi="Times New Roman" w:eastAsia="SimSun" w:cs="Times New Roman"/>
+                <w:color w:val="auto"/>
+                <w:sz w:val="22"/>
+                <w:szCs w:val="22"/>
+              </w:rPr>
+              <w:t>Personal and sensitive organizational data must not be disclosed or processed outside authorized boundaries without consent.</w:t>
+            </w:r>
+          </w:p>
+        </w:tc>
+        <w:tc>
+          <w:tcPr>
+            <w:tcW w:w="2952" w:type="dxa"/>
+            <w:vAlign w:val="center"/>
+          </w:tcPr>
+          <w:p>
+            <w:pPr>
+              <w:spacing w:line="240" w:lineRule="auto"/>
+              <w:jc w:val="both"/>
+              <w:rPr>
+                <w:rFonts w:hint="default" w:ascii="Times New Roman" w:hAnsi="Times New Roman" w:cs="Times New Roman"/>
+                <w:color w:val="auto"/>
+                <w:sz w:val="22"/>
+                <w:szCs w:val="22"/>
+                <w:vertAlign w:val="baseline"/>
+              </w:rPr>
+            </w:pPr>
+            <w:r>
+              <w:rPr>
+                <w:rFonts w:hint="default" w:ascii="Times New Roman" w:hAnsi="Times New Roman" w:eastAsia="SimSun" w:cs="Times New Roman"/>
+                <w:color w:val="auto"/>
+                <w:sz w:val="22"/>
+                <w:szCs w:val="22"/>
+              </w:rPr>
+              <w:t>Operating a strict local first architecture where document processing, vector storage, and model inference occur entirely on local disk storage without external API calls.</w:t>
+            </w:r>
+          </w:p>
+        </w:tc>
+      </w:tr>
+      <w:tr>
+        <w:tblPrEx>
+          <w:tblBorders>
+            <w:top w:val="single" w:color="auto" w:sz="4" w:space="0"/>
+            <w:left w:val="single" w:color="auto" w:sz="4" w:space="0"/>
+            <w:bottom w:val="single" w:color="auto" w:sz="4" w:space="0"/>
+            <w:right w:val="single" w:color="auto" w:sz="4" w:space="0"/>
+            <w:insideH w:val="single" w:color="auto" w:sz="4" w:space="0"/>
+            <w:insideV w:val="single" w:color="auto" w:sz="4" w:space="0"/>
+          </w:tblBorders>
+          <w:tblCellMar>
+            <w:top w:w="0" w:type="dxa"/>
+            <w:left w:w="108" w:type="dxa"/>
+            <w:bottom w:w="0" w:type="dxa"/>
+            <w:right w:w="108" w:type="dxa"/>
+          </w:tblCellMar>
+        </w:tblPrEx>
+        <w:tc>
+          <w:tcPr>
+            <w:tcW w:w="2952" w:type="dxa"/>
+            <w:vAlign w:val="center"/>
+          </w:tcPr>
+          <w:p>
+            <w:pPr>
+              <w:spacing w:line="240" w:lineRule="auto"/>
+              <w:jc w:val="both"/>
+              <w:rPr>
+                <w:rFonts w:hint="default" w:ascii="Times New Roman" w:hAnsi="Times New Roman" w:cs="Times New Roman"/>
+                <w:b w:val="0"/>
+                <w:bCs w:val="0"/>
+                <w:i w:val="0"/>
+                <w:iCs w:val="0"/>
+                <w:color w:val="auto"/>
+                <w:sz w:val="22"/>
+                <w:szCs w:val="22"/>
+                <w:vertAlign w:val="baseline"/>
+              </w:rPr>
+            </w:pPr>
+            <w:r>
+              <w:rPr>
+                <w:rFonts w:hint="default" w:ascii="Times New Roman" w:hAnsi="Times New Roman" w:eastAsia="SimSun" w:cs="Times New Roman"/>
+                <w:b w:val="0"/>
+                <w:bCs w:val="0"/>
+                <w:i w:val="0"/>
+                <w:iCs w:val="0"/>
+                <w:color w:val="auto"/>
+                <w:sz w:val="22"/>
+                <w:szCs w:val="22"/>
+              </w:rPr>
+              <w:t>Australian Privacy Principle 11 (Security of personal information)</w:t>
+            </w:r>
+          </w:p>
+        </w:tc>
+        <w:tc>
+          <w:tcPr>
+            <w:tcW w:w="2952" w:type="dxa"/>
+            <w:vAlign w:val="center"/>
+          </w:tcPr>
+          <w:p>
+            <w:pPr>
+              <w:spacing w:line="240" w:lineRule="auto"/>
+              <w:jc w:val="both"/>
+              <w:rPr>
+                <w:rFonts w:hint="default" w:ascii="Times New Roman" w:hAnsi="Times New Roman" w:cs="Times New Roman"/>
+                <w:b w:val="0"/>
+                <w:bCs w:val="0"/>
+                <w:i w:val="0"/>
+                <w:iCs w:val="0"/>
+                <w:color w:val="auto"/>
+                <w:sz w:val="22"/>
+                <w:szCs w:val="22"/>
+                <w:vertAlign w:val="baseline"/>
+              </w:rPr>
+            </w:pPr>
+            <w:r>
+              <w:rPr>
+                <w:rFonts w:hint="default" w:ascii="Times New Roman" w:hAnsi="Times New Roman" w:eastAsia="SimSun" w:cs="Times New Roman"/>
+                <w:b w:val="0"/>
+                <w:bCs w:val="0"/>
+                <w:i w:val="0"/>
+                <w:iCs w:val="0"/>
+                <w:color w:val="auto"/>
+                <w:sz w:val="22"/>
+                <w:szCs w:val="22"/>
+              </w:rPr>
+              <w:t>Entities must actively protect retained personal and enterprise information from misuse, loss, and unauthorized access.</w:t>
+            </w:r>
+          </w:p>
+        </w:tc>
+        <w:tc>
+          <w:tcPr>
+            <w:tcW w:w="2952" w:type="dxa"/>
+            <w:vAlign w:val="center"/>
+          </w:tcPr>
+          <w:p>
+            <w:pPr>
+              <w:spacing w:line="240" w:lineRule="auto"/>
+              <w:jc w:val="both"/>
+              <w:rPr>
+                <w:rFonts w:hint="default" w:ascii="Times New Roman" w:hAnsi="Times New Roman" w:cs="Times New Roman"/>
+                <w:b w:val="0"/>
+                <w:bCs w:val="0"/>
+                <w:i w:val="0"/>
+                <w:iCs w:val="0"/>
+                <w:color w:val="auto"/>
+                <w:sz w:val="22"/>
+                <w:szCs w:val="22"/>
+                <w:vertAlign w:val="baseline"/>
+              </w:rPr>
+            </w:pPr>
+            <w:r>
+              <w:rPr>
+                <w:rFonts w:hint="default" w:ascii="Times New Roman" w:hAnsi="Times New Roman" w:eastAsia="SimSun" w:cs="Times New Roman"/>
+                <w:b w:val="0"/>
+                <w:bCs w:val="0"/>
+                <w:i w:val="0"/>
+                <w:iCs w:val="0"/>
+                <w:color w:val="auto"/>
+                <w:sz w:val="22"/>
+                <w:szCs w:val="22"/>
+              </w:rPr>
+              <w:t>Leveraging Slack Socket Mode over outbound WebSockets to avoid opening inbound public ports or exposing static IP endpoints to the public internet.</w:t>
+            </w:r>
+          </w:p>
+        </w:tc>
+      </w:tr>
+      <w:tr>
+        <w:tblPrEx>
+          <w:tblBorders>
+            <w:top w:val="single" w:color="auto" w:sz="4" w:space="0"/>
+            <w:left w:val="single" w:color="auto" w:sz="4" w:space="0"/>
+            <w:bottom w:val="single" w:color="auto" w:sz="4" w:space="0"/>
+            <w:right w:val="single" w:color="auto" w:sz="4" w:space="0"/>
+            <w:insideH w:val="single" w:color="auto" w:sz="4" w:space="0"/>
+            <w:insideV w:val="single" w:color="auto" w:sz="4" w:space="0"/>
+          </w:tblBorders>
+          <w:tblCellMar>
+            <w:top w:w="0" w:type="dxa"/>
+            <w:left w:w="108" w:type="dxa"/>
+            <w:bottom w:w="0" w:type="dxa"/>
+            <w:right w:w="108" w:type="dxa"/>
+          </w:tblCellMar>
+        </w:tblPrEx>
+        <w:tc>
+          <w:tcPr>
+            <w:tcW w:w="2952" w:type="dxa"/>
+            <w:vAlign w:val="center"/>
+          </w:tcPr>
+          <w:p>
+            <w:pPr>
+              <w:spacing w:line="240" w:lineRule="auto"/>
+              <w:jc w:val="both"/>
+              <w:rPr>
+                <w:rFonts w:hint="default" w:ascii="Times New Roman" w:hAnsi="Times New Roman" w:cs="Times New Roman"/>
+                <w:b w:val="0"/>
+                <w:bCs w:val="0"/>
+                <w:i w:val="0"/>
+                <w:iCs w:val="0"/>
+                <w:color w:val="auto"/>
+                <w:sz w:val="22"/>
+                <w:szCs w:val="22"/>
+                <w:vertAlign w:val="baseline"/>
+              </w:rPr>
+            </w:pPr>
+            <w:r>
+              <w:rPr>
+                <w:rFonts w:hint="default" w:ascii="Times New Roman" w:hAnsi="Times New Roman" w:eastAsia="SimSun" w:cs="Times New Roman"/>
+                <w:b w:val="0"/>
+                <w:bCs w:val="0"/>
+                <w:i w:val="0"/>
+                <w:iCs w:val="0"/>
+                <w:color w:val="auto"/>
+                <w:sz w:val="22"/>
+                <w:szCs w:val="22"/>
+              </w:rPr>
+              <w:t>Privacy Act 1988 (Cth)</w:t>
+            </w:r>
+          </w:p>
+        </w:tc>
+        <w:tc>
+          <w:tcPr>
+            <w:tcW w:w="2952" w:type="dxa"/>
+            <w:vAlign w:val="center"/>
+          </w:tcPr>
+          <w:p>
+            <w:pPr>
+              <w:spacing w:line="240" w:lineRule="auto"/>
+              <w:jc w:val="both"/>
+              <w:rPr>
+                <w:rFonts w:hint="default" w:ascii="Times New Roman" w:hAnsi="Times New Roman" w:cs="Times New Roman"/>
+                <w:b w:val="0"/>
+                <w:bCs w:val="0"/>
+                <w:i w:val="0"/>
+                <w:iCs w:val="0"/>
+                <w:color w:val="auto"/>
+                <w:sz w:val="22"/>
+                <w:szCs w:val="22"/>
+                <w:vertAlign w:val="baseline"/>
+              </w:rPr>
+            </w:pPr>
+            <w:r>
+              <w:rPr>
+                <w:rFonts w:hint="default" w:ascii="Times New Roman" w:hAnsi="Times New Roman" w:eastAsia="SimSun" w:cs="Times New Roman"/>
+                <w:b w:val="0"/>
+                <w:bCs w:val="0"/>
+                <w:i w:val="0"/>
+                <w:iCs w:val="0"/>
+                <w:color w:val="auto"/>
+                <w:sz w:val="22"/>
+                <w:szCs w:val="22"/>
+              </w:rPr>
+              <w:t>Organizations must implement structured controls to handle proprietary and employee data responsibly.</w:t>
+            </w:r>
+          </w:p>
+        </w:tc>
+        <w:tc>
+          <w:tcPr>
+            <w:tcW w:w="2952" w:type="dxa"/>
+            <w:vAlign w:val="center"/>
+          </w:tcPr>
+          <w:p>
+            <w:pPr>
+              <w:spacing w:line="240" w:lineRule="auto"/>
+              <w:jc w:val="both"/>
+              <w:rPr>
+                <w:rFonts w:hint="default" w:ascii="Times New Roman" w:hAnsi="Times New Roman" w:cs="Times New Roman"/>
+                <w:b w:val="0"/>
+                <w:bCs w:val="0"/>
+                <w:i w:val="0"/>
+                <w:iCs w:val="0"/>
+                <w:color w:val="auto"/>
+                <w:sz w:val="22"/>
+                <w:szCs w:val="22"/>
+                <w:vertAlign w:val="baseline"/>
+              </w:rPr>
+            </w:pPr>
+            <w:r>
+              <w:rPr>
+                <w:rFonts w:hint="default" w:ascii="Times New Roman" w:hAnsi="Times New Roman" w:eastAsia="SimSun" w:cs="Times New Roman"/>
+                <w:b w:val="0"/>
+                <w:bCs w:val="0"/>
+                <w:i w:val="0"/>
+                <w:iCs w:val="0"/>
+                <w:color w:val="auto"/>
+                <w:sz w:val="22"/>
+                <w:szCs w:val="22"/>
+              </w:rPr>
+              <w:t>Implementing strict channel level access controls and local database indexing to restrict retrieved search contexts to authorized Slack users.</w:t>
+            </w:r>
+          </w:p>
+        </w:tc>
+      </w:tr>
+      <w:tr>
+        <w:tblPrEx>
+          <w:tblBorders>
+            <w:top w:val="single" w:color="auto" w:sz="4" w:space="0"/>
+            <w:left w:val="single" w:color="auto" w:sz="4" w:space="0"/>
+            <w:bottom w:val="single" w:color="auto" w:sz="4" w:space="0"/>
+            <w:right w:val="single" w:color="auto" w:sz="4" w:space="0"/>
+            <w:insideH w:val="single" w:color="auto" w:sz="4" w:space="0"/>
+            <w:insideV w:val="single" w:color="auto" w:sz="4" w:space="0"/>
+          </w:tblBorders>
+          <w:tblCellMar>
+            <w:top w:w="0" w:type="dxa"/>
+            <w:left w:w="108" w:type="dxa"/>
+            <w:bottom w:w="0" w:type="dxa"/>
+            <w:right w:w="108" w:type="dxa"/>
+          </w:tblCellMar>
+        </w:tblPrEx>
+        <w:tc>
+          <w:tcPr>
+            <w:tcW w:w="2952" w:type="dxa"/>
+            <w:vAlign w:val="center"/>
+          </w:tcPr>
+          <w:p>
+            <w:pPr>
+              <w:spacing w:line="240" w:lineRule="auto"/>
+              <w:jc w:val="both"/>
+              <w:rPr>
+                <w:rFonts w:hint="default" w:ascii="Times New Roman" w:hAnsi="Times New Roman" w:cs="Times New Roman"/>
+                <w:b w:val="0"/>
+                <w:bCs w:val="0"/>
+                <w:i w:val="0"/>
+                <w:iCs w:val="0"/>
+                <w:color w:val="auto"/>
+                <w:sz w:val="22"/>
+                <w:szCs w:val="22"/>
+                <w:vertAlign w:val="baseline"/>
+              </w:rPr>
+            </w:pPr>
+            <w:r>
+              <w:rPr>
+                <w:rFonts w:hint="default" w:ascii="Times New Roman" w:hAnsi="Times New Roman" w:eastAsia="SimSun" w:cs="Times New Roman"/>
+                <w:b w:val="0"/>
+                <w:bCs w:val="0"/>
+                <w:i w:val="0"/>
+                <w:iCs w:val="0"/>
+                <w:color w:val="auto"/>
+                <w:sz w:val="22"/>
+                <w:szCs w:val="22"/>
+              </w:rPr>
+              <w:t>IEEE Standard for Ethics of Autonomous Systems (P7000)</w:t>
+            </w:r>
+          </w:p>
+        </w:tc>
+        <w:tc>
+          <w:tcPr>
+            <w:tcW w:w="2952" w:type="dxa"/>
+            <w:vAlign w:val="center"/>
+          </w:tcPr>
+          <w:p>
+            <w:pPr>
+              <w:spacing w:line="240" w:lineRule="auto"/>
+              <w:jc w:val="both"/>
+              <w:rPr>
+                <w:rFonts w:hint="default" w:ascii="Times New Roman" w:hAnsi="Times New Roman" w:cs="Times New Roman"/>
+                <w:b w:val="0"/>
+                <w:bCs w:val="0"/>
+                <w:i w:val="0"/>
+                <w:iCs w:val="0"/>
+                <w:color w:val="auto"/>
+                <w:sz w:val="22"/>
+                <w:szCs w:val="22"/>
+                <w:vertAlign w:val="baseline"/>
+              </w:rPr>
+            </w:pPr>
+            <w:r>
+              <w:rPr>
+                <w:rFonts w:hint="default" w:ascii="Times New Roman" w:hAnsi="Times New Roman" w:eastAsia="SimSun" w:cs="Times New Roman"/>
+                <w:b w:val="0"/>
+                <w:bCs w:val="0"/>
+                <w:i w:val="0"/>
+                <w:iCs w:val="0"/>
+                <w:color w:val="auto"/>
+                <w:sz w:val="22"/>
+                <w:szCs w:val="22"/>
+              </w:rPr>
+              <w:t>Autonomous and AI based systems must prioritize data privacy, transparency, and user safety by design.</w:t>
+            </w:r>
+          </w:p>
+        </w:tc>
+        <w:tc>
+          <w:tcPr>
+            <w:tcW w:w="2952" w:type="dxa"/>
+            <w:vAlign w:val="center"/>
+          </w:tcPr>
+          <w:p>
+            <w:pPr>
+              <w:spacing w:line="240" w:lineRule="auto"/>
+              <w:jc w:val="both"/>
+              <w:rPr>
+                <w:rFonts w:hint="default" w:ascii="Times New Roman" w:hAnsi="Times New Roman" w:cs="Times New Roman"/>
+                <w:b w:val="0"/>
+                <w:bCs w:val="0"/>
+                <w:i w:val="0"/>
+                <w:iCs w:val="0"/>
+                <w:color w:val="auto"/>
+                <w:sz w:val="22"/>
+                <w:szCs w:val="22"/>
+                <w:vertAlign w:val="baseline"/>
+              </w:rPr>
+            </w:pPr>
+            <w:r>
+              <w:rPr>
+                <w:rFonts w:hint="default" w:ascii="Times New Roman" w:hAnsi="Times New Roman" w:eastAsia="SimSun" w:cs="Times New Roman"/>
+                <w:b w:val="0"/>
+                <w:bCs w:val="0"/>
+                <w:i w:val="0"/>
+                <w:iCs w:val="0"/>
+                <w:color w:val="auto"/>
+                <w:sz w:val="22"/>
+                <w:szCs w:val="22"/>
+              </w:rPr>
+              <w:t>Enforcing retrieval grounded generation where responses are synthesized strictly from indexed internal files, eliminating unsupported AI fabrications.</w:t>
+            </w:r>
+          </w:p>
+        </w:tc>
+      </w:tr>
+    </w:tbl>
+    <w:p>
+      <w:pPr>
         <w:spacing w:line="240" w:lineRule="auto"/>
-        <w:rPr>
-          <w:rFonts w:hint="default" w:ascii="Times New Roman" w:hAnsi="Times New Roman" w:cs="Times New Roman"/>
-        </w:rPr>
-      </w:pPr>
-      <w:r>
-        <w:rPr>
-          <w:rFonts w:hint="default" w:ascii="Times New Roman" w:hAnsi="Times New Roman" w:cs="Times New Roman"/>
-        </w:rPr>
-        <w:t>[</w:t>
-      </w:r>
-      <w:r>
-        <w:rPr>
-          <w:rFonts w:hint="default" w:ascii="Times New Roman" w:hAnsi="Times New Roman" w:cs="Times New Roman"/>
-          <w:i/>
-          <w:iCs/>
-        </w:rPr>
-        <w:t>Review relevant ethical protocols and standards that need to be adhered to for the particular problem you are solving. (e.g. ethical considerations for health data collection, AI implementation). The Australian Privacy Principles can be a good starting point. You should also review some Australian and international Acts related to your area</w:t>
-      </w:r>
-      <w:r>
-        <w:rPr>
-          <w:rFonts w:hint="default" w:ascii="Times New Roman" w:hAnsi="Times New Roman" w:cs="Times New Roman"/>
-        </w:rPr>
-        <w:t>. This section can be enriched with a table to indicate what protocols apply to your project and how you propose to ensure the protocols are followed.]</w:t>
+        <w:jc w:val="both"/>
+        <w:rPr>
+          <w:rFonts w:hint="default" w:ascii="Times New Roman" w:hAnsi="Times New Roman" w:cs="Times New Roman"/>
+        </w:rPr>
+      </w:pPr>
+    </w:p>
+    <w:p>
+      <w:pPr>
+        <w:pStyle w:val="2"/>
+        <w:bidi w:val="0"/>
+        <w:jc w:val="both"/>
+        <w:rPr>
+          <w:rFonts w:hint="default"/>
+          <w:lang w:val="en-US"/>
+        </w:rPr>
+      </w:pPr>
+      <w:r>
+        <w:rPr>
+          <w:rFonts w:hint="default"/>
+          <w:lang w:val="en-US"/>
+        </w:rPr>
+        <w:t>References</w:t>
+      </w:r>
+    </w:p>
+    <w:p>
+      <w:pPr>
+        <w:pStyle w:val="34"/>
+        <w:keepNext w:val="0"/>
+        <w:keepLines w:val="0"/>
+        <w:widowControl/>
+        <w:suppressLineNumbers w:val="0"/>
+        <w:jc w:val="both"/>
+      </w:pPr>
+      <w:r>
+        <w:t xml:space="preserve">[1] Office of the Australian Information Commissioner, "Australian Privacy Principles," OAIC, Canberra, ACT, Australia, 2014. [Online]. Available: </w:t>
+      </w:r>
+      <w:r>
+        <w:fldChar w:fldCharType="begin"/>
+      </w:r>
+      <w:r>
+        <w:instrText xml:space="preserve"> HYPERLINK "https://www.oaic.gov.au/privacy/australian-privacy-principles" \t "_blank" </w:instrText>
+      </w:r>
+      <w:r>
+        <w:fldChar w:fldCharType="separate"/>
+      </w:r>
+      <w:r>
+        <w:rPr>
+          <w:rStyle w:val="30"/>
+        </w:rPr>
+        <w:t>https://www.oaic.gov.au/privacy/australian-privacy-principles</w:t>
+      </w:r>
+      <w:r>
+        <w:fldChar w:fldCharType="end"/>
+      </w:r>
+    </w:p>
+    <w:p>
+      <w:pPr>
+        <w:pStyle w:val="34"/>
+        <w:keepNext w:val="0"/>
+        <w:keepLines w:val="0"/>
+        <w:widowControl/>
+        <w:suppressLineNumbers w:val="0"/>
+        <w:jc w:val="both"/>
+      </w:pPr>
+      <w:r>
+        <w:t xml:space="preserve">[2] Commonwealth Parliament of Australia, "Privacy Act 1988," Attorney General Department, Canberra, ACT, Australia, Act No. 119, 1988. [Online]. Available: </w:t>
+      </w:r>
+      <w:r>
+        <w:fldChar w:fldCharType="begin"/>
+      </w:r>
+      <w:r>
+        <w:instrText xml:space="preserve"> HYPERLINK "https://www.legislation.gov.au/Details/C2021C00452" \t "_blank" </w:instrText>
+      </w:r>
+      <w:r>
+        <w:fldChar w:fldCharType="separate"/>
+      </w:r>
+      <w:r>
+        <w:rPr>
+          <w:rStyle w:val="30"/>
+        </w:rPr>
+        <w:t>https://www.legislation.gov.au/Details/C2021C00452</w:t>
+      </w:r>
+      <w:r>
+        <w:fldChar w:fldCharType="end"/>
+      </w:r>
+    </w:p>
+    <w:p>
+      <w:pPr>
+        <w:pStyle w:val="34"/>
+        <w:keepNext w:val="0"/>
+        <w:keepLines w:val="0"/>
+        <w:widowControl/>
+        <w:suppressLineNumbers w:val="0"/>
+        <w:jc w:val="both"/>
+      </w:pPr>
+      <w:r>
+        <w:t xml:space="preserve">[3] IEEE Standards Association, "IEEE Standard Model Process for Addressing Ethical Concerns during System Design," IEEE Std P7000, 2021. [Online]. Available: </w:t>
+      </w:r>
+      <w:r>
+        <w:fldChar w:fldCharType="begin"/>
+      </w:r>
+      <w:r>
+        <w:instrText xml:space="preserve"> HYPERLINK "https://www.google.com/search?q=https://standards.ieee.org/ieee/7000/6958/" \t "_blank" </w:instrText>
+      </w:r>
+      <w:r>
+        <w:fldChar w:fldCharType="separate"/>
+      </w:r>
+      <w:r>
+        <w:rPr>
+          <w:rStyle w:val="30"/>
+        </w:rPr>
+        <w:t>https://standards.ieee.org/ieee/7000/6958/</w:t>
+      </w:r>
+      <w:r>
+        <w:fldChar w:fldCharType="end"/>
+      </w:r>
+    </w:p>
+    <w:p>
+      <w:pPr>
+        <w:pStyle w:val="34"/>
+        <w:keepNext w:val="0"/>
+        <w:keepLines w:val="0"/>
+        <w:widowControl/>
+        <w:suppressLineNumbers w:val="0"/>
+        <w:jc w:val="both"/>
+      </w:pPr>
+      <w:r>
+        <w:t>[4] P. Lewis, E. Perez, A. Piktus, Y. Petroni, V. Karpukhin, N. Goyal, H. Küttler, M. Lewis, W. Yih, T. Rocktäschel, S. Riedel, and D. Kiela, "Retrieval Augmented Generation for Knowledge Intensive NLP Tasks," in Advances in Neural Information Processing Systems, vol. 33, pp. 9459–9474, 2020.</w:t>
+      </w:r>
+    </w:p>
+    <w:p>
+      <w:pPr>
+        <w:pStyle w:val="34"/>
+        <w:keepNext w:val="0"/>
+        <w:keepLines w:val="0"/>
+        <w:widowControl/>
+        <w:suppressLineNumbers w:val="0"/>
+        <w:jc w:val="both"/>
+      </w:pPr>
+      <w:r>
+        <w:t xml:space="preserve">[5] Ollama Development Team, "Ollama Documentation: Get Up and Running with Llama 3 and Local LLMs," Ollama AI, 2024. [Online]. Available: </w:t>
+      </w:r>
+      <w:r>
+        <w:fldChar w:fldCharType="begin"/>
+      </w:r>
+      <w:r>
+        <w:instrText xml:space="preserve"> HYPERLINK "https://ollama.com/docs" \t "_blank" </w:instrText>
+      </w:r>
+      <w:r>
+        <w:fldChar w:fldCharType="separate"/>
+      </w:r>
+      <w:r>
+        <w:rPr>
+          <w:rStyle w:val="30"/>
+        </w:rPr>
+        <w:t>https://ollama.com/docs</w:t>
+      </w:r>
+      <w:r>
+        <w:fldChar w:fldCharType="end"/>
+      </w:r>
+    </w:p>
+    <w:p>
+      <w:pPr>
+        <w:pStyle w:val="34"/>
+        <w:keepNext w:val="0"/>
+        <w:keepLines w:val="0"/>
+        <w:widowControl/>
+        <w:suppressLineNumbers w:val="0"/>
+        <w:jc w:val="both"/>
+      </w:pPr>
+      <w:r>
+        <w:t xml:space="preserve">[6] ChromaDB Development Team, "Chroma: The Open Source Embedding Database," ChromaDB, 2024. [Online]. Available: </w:t>
+      </w:r>
+      <w:r>
+        <w:fldChar w:fldCharType="begin"/>
+      </w:r>
+      <w:r>
+        <w:instrText xml:space="preserve"> HYPERLINK "https://docs.trychroma.com/" \t "_blank" </w:instrText>
+      </w:r>
+      <w:r>
+        <w:fldChar w:fldCharType="separate"/>
+      </w:r>
+      <w:r>
+        <w:rPr>
+          <w:rStyle w:val="30"/>
+        </w:rPr>
+        <w:t>https://docs.trychroma.com/</w:t>
+      </w:r>
+      <w:r>
+        <w:fldChar w:fldCharType="end"/>
+      </w:r>
+    </w:p>
+    <w:p>
+      <w:pPr>
+        <w:pStyle w:val="34"/>
+        <w:keepNext w:val="0"/>
+        <w:keepLines w:val="0"/>
+        <w:widowControl/>
+        <w:suppressLineNumbers w:val="0"/>
+        <w:jc w:val="both"/>
+      </w:pPr>
+      <w:r>
+        <w:t xml:space="preserve">[7] Slack Technologies, "Slack Bolt for Python Documentation," Salesforce, 2024. [Online]. Available: </w:t>
+      </w:r>
+      <w:r>
+        <w:fldChar w:fldCharType="begin"/>
+      </w:r>
+      <w:r>
+        <w:instrText xml:space="preserve"> HYPERLINK "https://www.google.com/search?q=https://slack.dev/bolt-python/" \t "_blank" </w:instrText>
+      </w:r>
+      <w:r>
+        <w:fldChar w:fldCharType="separate"/>
+      </w:r>
+      <w:r>
+        <w:rPr>
+          <w:rStyle w:val="30"/>
+        </w:rPr>
+        <w:t>https://slack.dev/bolt-python/</w:t>
+      </w:r>
+      <w:r>
+        <w:fldChar w:fldCharType="end"/>
+      </w:r>
+    </w:p>
+    <w:p>
+      <w:pPr>
+        <w:pStyle w:val="34"/>
+        <w:keepNext w:val="0"/>
+        <w:keepLines w:val="0"/>
+        <w:widowControl/>
+        <w:suppressLineNumbers w:val="0"/>
+        <w:jc w:val="both"/>
+      </w:pPr>
+      <w:r>
+        <w:t xml:space="preserve">[8] Slack Technologies, "Understanding Socket Mode in Slack API," Salesforce, 2024. [Online]. Available: </w:t>
+      </w:r>
+      <w:r>
+        <w:fldChar w:fldCharType="begin"/>
+      </w:r>
+      <w:r>
+        <w:instrText xml:space="preserve"> HYPERLINK "https://www.google.com/search?q=https://api.slack.com/apis/connections/socket" \t "_blank" </w:instrText>
+      </w:r>
+      <w:r>
+        <w:fldChar w:fldCharType="separate"/>
+      </w:r>
+      <w:r>
+        <w:rPr>
+          <w:rStyle w:val="30"/>
+        </w:rPr>
+        <w:t>https://api.slack.com/apis/connections/socket</w:t>
+      </w:r>
+      <w:r>
+        <w:fldChar w:fldCharType="end"/>
+      </w:r>
+    </w:p>
+    <w:p>
+      <w:pPr>
+        <w:pStyle w:val="34"/>
+        <w:keepNext w:val="0"/>
+        <w:keepLines w:val="0"/>
+        <w:widowControl/>
+        <w:suppressLineNumbers w:val="0"/>
+        <w:jc w:val="both"/>
+      </w:pPr>
+      <w:r>
+        <w:t xml:space="preserve">[9] LangChain AI, "LangChain Documentation: Building Applications with LLMs through Composability," LangChain, 2024. [Online]. Available: </w:t>
+      </w:r>
+      <w:r>
+        <w:fldChar w:fldCharType="begin"/>
+      </w:r>
+      <w:r>
+        <w:instrText xml:space="preserve"> HYPERLINK "https://python.langchain.com/docs/" \t "_blank" </w:instrText>
+      </w:r>
+      <w:r>
+        <w:fldChar w:fldCharType="separate"/>
+      </w:r>
+      <w:r>
+        <w:rPr>
+          <w:rStyle w:val="30"/>
+        </w:rPr>
+        <w:t>https://python.langchain.com/docs/</w:t>
+      </w:r>
+      <w:r>
+        <w:fldChar w:fldCharType="end"/>
+      </w:r>
+    </w:p>
+    <w:p>
+      <w:pPr>
+        <w:pStyle w:val="34"/>
+        <w:keepNext w:val="0"/>
+        <w:keepLines w:val="0"/>
+        <w:widowControl/>
+        <w:suppressLineNumbers w:val="0"/>
+        <w:jc w:val="both"/>
+      </w:pPr>
+      <w:r>
+        <w:t xml:space="preserve">[10] LlamaIndex Development Team, "LlamaIndex: Data Framework for LLM Applications," LlamaIndex, 2024. [Online]. Available: </w:t>
+      </w:r>
+      <w:r>
+        <w:fldChar w:fldCharType="begin"/>
+      </w:r>
+      <w:r>
+        <w:instrText xml:space="preserve"> HYPERLINK "https://docs.llamaindex.ai/" \t "_blank" </w:instrText>
+      </w:r>
+      <w:r>
+        <w:fldChar w:fldCharType="separate"/>
+      </w:r>
+      <w:r>
+        <w:rPr>
+          <w:rStyle w:val="30"/>
+        </w:rPr>
+        <w:t>https://docs.llamaindex.ai/</w:t>
+      </w:r>
+      <w:r>
+        <w:fldChar w:fldCharType="end"/>
       </w:r>
     </w:p>
     <w:p>
       <w:pPr>
         <w:spacing w:line="240" w:lineRule="auto"/>
-        <w:rPr>
-          <w:rFonts w:hint="default" w:ascii="Times New Roman" w:hAnsi="Times New Roman" w:cs="Times New Roman"/>
-        </w:rPr>
-      </w:pPr>
-    </w:p>
-    <w:p>
-      <w:pPr>
-        <w:spacing w:line="240" w:lineRule="auto"/>
-        <w:rPr>
-          <w:rFonts w:hint="default" w:ascii="Times New Roman" w:hAnsi="Times New Roman" w:cs="Times New Roman"/>
-        </w:rPr>
-      </w:pPr>
-    </w:p>
-    <w:p>
-      <w:pPr>
-        <w:spacing w:line="240" w:lineRule="auto"/>
-        <w:rPr>
-          <w:rFonts w:hint="default" w:ascii="Times New Roman" w:hAnsi="Times New Roman" w:cs="Times New Roman"/>
-          <w:lang w:val="en-AU"/>
-        </w:rPr>
-      </w:pPr>
-    </w:p>
-    <w:p>
-      <w:pPr>
-        <w:spacing w:line="240" w:lineRule="auto"/>
+        <w:jc w:val="both"/>
         <w:rPr>
           <w:rFonts w:hint="default" w:ascii="Times New Roman" w:hAnsi="Times New Roman" w:cs="Times New Roman"/>
         </w:rPr>
@@ -2233,6 +4633,72 @@
     </w:lvl>
   </w:abstractNum>
   <w:abstractNum w:abstractNumId="1">
+    <w:nsid w:val="93F32DCE"/>
+    <w:multiLevelType w:val="singleLevel"/>
+    <w:tmpl w:val="93F32DCE"/>
+    <w:lvl w:ilvl="0" w:tentative="0">
+      <w:start w:val="1"/>
+      <w:numFmt w:val="bullet"/>
+      <w:lvlText w:val=""/>
+      <w:lvlJc w:val="left"/>
+      <w:pPr>
+        <w:tabs>
+          <w:tab w:val="left" w:pos="420"/>
+        </w:tabs>
+        <w:ind w:left="420" w:leftChars="0" w:hanging="420" w:firstLineChars="0"/>
+      </w:pPr>
+      <w:rPr>
+        <w:rFonts w:hint="default" w:ascii="Wingdings" w:hAnsi="Wingdings"/>
+        <w:sz w:val="16"/>
+        <w:szCs w:val="16"/>
+      </w:rPr>
+    </w:lvl>
+  </w:abstractNum>
+  <w:abstractNum w:abstractNumId="2">
+    <w:nsid w:val="BBF8D60F"/>
+    <w:multiLevelType w:val="singleLevel"/>
+    <w:tmpl w:val="BBF8D60F"/>
+    <w:lvl w:ilvl="0" w:tentative="0">
+      <w:start w:val="1"/>
+      <w:numFmt w:val="bullet"/>
+      <w:lvlText w:val=""/>
+      <w:lvlJc w:val="left"/>
+      <w:pPr>
+        <w:tabs>
+          <w:tab w:val="left" w:pos="420"/>
+        </w:tabs>
+        <w:ind w:left="420" w:leftChars="0" w:hanging="420" w:firstLineChars="0"/>
+      </w:pPr>
+      <w:rPr>
+        <w:rFonts w:hint="default" w:ascii="Wingdings" w:hAnsi="Wingdings"/>
+        <w:sz w:val="16"/>
+        <w:szCs w:val="16"/>
+      </w:rPr>
+    </w:lvl>
+  </w:abstractNum>
+  <w:abstractNum w:abstractNumId="3">
+    <w:nsid w:val="DBD50914"/>
+    <w:multiLevelType w:val="singleLevel"/>
+    <w:tmpl w:val="DBD50914"/>
+    <w:lvl w:ilvl="0" w:tentative="0">
+      <w:start w:val="1"/>
+      <w:numFmt w:val="bullet"/>
+      <w:lvlText w:val=""/>
+      <w:lvlJc w:val="left"/>
+      <w:pPr>
+        <w:tabs>
+          <w:tab w:val="left" w:pos="420"/>
+        </w:tabs>
+        <w:ind w:left="420" w:leftChars="0" w:hanging="420" w:firstLineChars="0"/>
+      </w:pPr>
+      <w:rPr>
+        <w:rFonts w:hint="default" w:ascii="Wingdings" w:hAnsi="Wingdings"/>
+        <w:sz w:val="16"/>
+        <w:szCs w:val="16"/>
+      </w:rPr>
+    </w:lvl>
+  </w:abstractNum>
+  <w:abstractNum w:abstractNumId="4">
     <w:nsid w:val="F2D2492E"/>
     <w:multiLevelType w:val="singleLevel"/>
     <w:tmpl w:val="F2D2492E"/>
@@ -2244,7 +4710,29 @@
       <w:lvlJc w:val="left"/>
     </w:lvl>
   </w:abstractNum>
-  <w:abstractNum w:abstractNumId="2">
+  <w:abstractNum w:abstractNumId="5">
+    <w:nsid w:val="F3AC29D2"/>
+    <w:multiLevelType w:val="singleLevel"/>
+    <w:tmpl w:val="F3AC29D2"/>
+    <w:lvl w:ilvl="0" w:tentative="0">
+      <w:start w:val="1"/>
+      <w:numFmt w:val="bullet"/>
+      <w:lvlText w:val=""/>
+      <w:lvlJc w:val="left"/>
+      <w:pPr>
+        <w:tabs>
+          <w:tab w:val="left" w:pos="420"/>
+        </w:tabs>
+        <w:ind w:left="420" w:leftChars="0" w:hanging="420" w:firstLineChars="0"/>
+      </w:pPr>
+      <w:rPr>
+        <w:rFonts w:hint="default" w:ascii="Wingdings" w:hAnsi="Wingdings"/>
+        <w:sz w:val="16"/>
+        <w:szCs w:val="16"/>
+      </w:rPr>
+    </w:lvl>
+  </w:abstractNum>
+  <w:abstractNum w:abstractNumId="6">
     <w:nsid w:val="FFFFFF88"/>
     <w:multiLevelType w:val="singleLevel"/>
     <w:tmpl w:val="FFFFFF88"/>
@@ -2262,7 +4750,7 @@
       </w:pPr>
     </w:lvl>
   </w:abstractNum>
-  <w:abstractNum w:abstractNumId="3">
+  <w:abstractNum w:abstractNumId="7">
     <w:nsid w:val="FFFFFF89"/>
     <w:multiLevelType w:val="singleLevel"/>
     <w:tmpl w:val="FFFFFF89"/>
@@ -2289,7 +4777,7 @@
       </w:rPr>
     </w:lvl>
   </w:abstractNum>
-  <w:abstractNum w:abstractNumId="4">
+  <w:abstractNum w:abstractNumId="8">
     <w:nsid w:val="03B54FB3"/>
     <w:multiLevelType w:val="singleLevel"/>
     <w:tmpl w:val="03B54FB3"/>
@@ -2311,20 +4799,157 @@
       </w:rPr>
     </w:lvl>
   </w:abstractNum>
+  <w:abstractNum w:abstractNumId="9">
+    <w:nsid w:val="0C83E07B"/>
+    <w:multiLevelType w:val="singleLevel"/>
+    <w:tmpl w:val="0C83E07B"/>
+    <w:lvl w:ilvl="0" w:tentative="0">
+      <w:start w:val="1"/>
+      <w:numFmt w:val="bullet"/>
+      <w:lvlText w:val=""/>
+      <w:lvlJc w:val="left"/>
+      <w:pPr>
+        <w:tabs>
+          <w:tab w:val="left" w:pos="420"/>
+        </w:tabs>
+        <w:ind w:left="420" w:leftChars="0" w:hanging="420" w:firstLineChars="0"/>
+      </w:pPr>
+      <w:rPr>
+        <w:rFonts w:hint="default" w:ascii="Wingdings" w:hAnsi="Wingdings"/>
+        <w:sz w:val="16"/>
+        <w:szCs w:val="16"/>
+      </w:rPr>
+    </w:lvl>
+  </w:abstractNum>
+  <w:abstractNum w:abstractNumId="10">
+    <w:nsid w:val="11BD93F2"/>
+    <w:multiLevelType w:val="singleLevel"/>
+    <w:tmpl w:val="11BD93F2"/>
+    <w:lvl w:ilvl="0" w:tentative="0">
+      <w:start w:val="1"/>
+      <w:numFmt w:val="bullet"/>
+      <w:lvlText w:val=""/>
+      <w:lvlJc w:val="left"/>
+      <w:pPr>
+        <w:tabs>
+          <w:tab w:val="left" w:pos="420"/>
+        </w:tabs>
+        <w:ind w:left="420" w:leftChars="0" w:hanging="420" w:firstLineChars="0"/>
+      </w:pPr>
+      <w:rPr>
+        <w:rFonts w:hint="default" w:ascii="Wingdings" w:hAnsi="Wingdings"/>
+        <w:sz w:val="16"/>
+        <w:szCs w:val="16"/>
+      </w:rPr>
+    </w:lvl>
+  </w:abstractNum>
+  <w:abstractNum w:abstractNumId="11">
+    <w:nsid w:val="1A90D93A"/>
+    <w:multiLevelType w:val="singleLevel"/>
+    <w:tmpl w:val="1A90D93A"/>
+    <w:lvl w:ilvl="0" w:tentative="0">
+      <w:start w:val="1"/>
+      <w:numFmt w:val="bullet"/>
+      <w:lvlText w:val=""/>
+      <w:lvlJc w:val="left"/>
+      <w:pPr>
+        <w:tabs>
+          <w:tab w:val="left" w:pos="420"/>
+        </w:tabs>
+        <w:ind w:left="420" w:leftChars="0" w:hanging="420" w:firstLineChars="0"/>
+      </w:pPr>
+      <w:rPr>
+        <w:rFonts w:hint="default" w:ascii="Wingdings" w:hAnsi="Wingdings"/>
+        <w:sz w:val="16"/>
+        <w:szCs w:val="16"/>
+      </w:rPr>
+    </w:lvl>
+  </w:abstractNum>
+  <w:abstractNum w:abstractNumId="12">
+    <w:nsid w:val="4EAD2C40"/>
+    <w:multiLevelType w:val="singleLevel"/>
+    <w:tmpl w:val="4EAD2C40"/>
+    <w:lvl w:ilvl="0" w:tentative="0">
+      <w:start w:val="1"/>
+      <w:numFmt w:val="bullet"/>
+      <w:lvlText w:val=""/>
+      <w:lvlJc w:val="left"/>
+      <w:pPr>
+        <w:tabs>
+          <w:tab w:val="left" w:pos="420"/>
+        </w:tabs>
+        <w:ind w:left="420" w:leftChars="0" w:hanging="420" w:firstLineChars="0"/>
+      </w:pPr>
+      <w:rPr>
+        <w:rFonts w:hint="default" w:ascii="Wingdings" w:hAnsi="Wingdings"/>
+        <w:sz w:val="16"/>
+        <w:szCs w:val="16"/>
+      </w:rPr>
+    </w:lvl>
+  </w:abstractNum>
+  <w:abstractNum w:abstractNumId="13">
+    <w:nsid w:val="6B962E94"/>
+    <w:multiLevelType w:val="singleLevel"/>
+    <w:tmpl w:val="6B962E94"/>
+    <w:lvl w:ilvl="0" w:tentative="0">
+      <w:start w:val="1"/>
+      <w:numFmt w:val="bullet"/>
+      <w:lvlText w:val=""/>
+      <w:lvlJc w:val="left"/>
+      <w:pPr>
+        <w:tabs>
+          <w:tab w:val="left" w:pos="420"/>
+        </w:tabs>
+        <w:ind w:left="420" w:leftChars="0" w:hanging="420" w:firstLineChars="0"/>
+      </w:pPr>
+      <w:rPr>
+        <w:rFonts w:hint="default" w:ascii="Wingdings" w:hAnsi="Wingdings"/>
+        <w:sz w:val="16"/>
+        <w:szCs w:val="16"/>
+      </w:rPr>
+    </w:lvl>
+  </w:abstractNum>
   <w:num w:numId="1">
-    <w:abstractNumId w:val="3"/>
+    <w:abstractNumId w:val="7"/>
   </w:num>
   <w:num w:numId="2">
-    <w:abstractNumId w:val="2"/>
+    <w:abstractNumId w:val="6"/>
   </w:num>
   <w:num w:numId="3">
-    <w:abstractNumId w:val="4"/>
+    <w:abstractNumId w:val="8"/>
   </w:num>
   <w:num w:numId="4">
     <w:abstractNumId w:val="0"/>
   </w:num>
   <w:num w:numId="5">
+    <w:abstractNumId w:val="4"/>
+  </w:num>
+  <w:num w:numId="6">
+    <w:abstractNumId w:val="10"/>
+  </w:num>
+  <w:num w:numId="7">
+    <w:abstractNumId w:val="12"/>
+  </w:num>
+  <w:num w:numId="8">
+    <w:abstractNumId w:val="9"/>
+  </w:num>
+  <w:num w:numId="9">
+    <w:abstractNumId w:val="5"/>
+  </w:num>
+  <w:num w:numId="10">
     <w:abstractNumId w:val="1"/>
+  </w:num>
+  <w:num w:numId="11">
+    <w:abstractNumId w:val="13"/>
+  </w:num>
+  <w:num w:numId="12">
+    <w:abstractNumId w:val="2"/>
+  </w:num>
+  <w:num w:numId="13">
+    <w:abstractNumId w:val="3"/>
+  </w:num>
+  <w:num w:numId="14">
+    <w:abstractNumId w:val="11"/>
   </w:num>
 </w:numbering>
 </file>
@@ -2488,7 +5113,7 @@
     <w:lsdException w:uiPriority="99" w:name="Table Web 2"/>
     <w:lsdException w:uiPriority="99" w:name="Table Web 3"/>
     <w:lsdException w:qFormat="1" w:uiPriority="99" w:name="Balloon Text"/>
-    <w:lsdException w:unhideWhenUsed="0" w:uiPriority="39" w:semiHidden="0" w:name="Table Grid"/>
+    <w:lsdException w:qFormat="1" w:unhideWhenUsed="0" w:uiPriority="39" w:semiHidden="0" w:name="Table Grid"/>
     <w:lsdException w:uiPriority="99" w:name="Table Theme"/>
     <w:lsdException w:qFormat="1" w:unhideWhenUsed="0" w:uiPriority="99" w:name="Placeholder Text"/>
     <w:lsdException w:unhideWhenUsed="0" w:uiPriority="60" w:semiHidden="0" w:name="Light Shading"/>
@@ -2497,14 +5122,14 @@
     <w:lsdException w:unhideWhenUsed="0" w:uiPriority="63" w:semiHidden="0" w:name="Medium Shading 1"/>
     <w:lsdException w:unhideWhenUsed="0" w:uiPriority="64" w:semiHidden="0" w:name="Medium Shading 2"/>
     <w:lsdException w:unhideWhenUsed="0" w:uiPriority="65" w:semiHidden="0" w:name="Medium List 1"/>
-    <w:lsdException w:unhideWhenUsed="0" w:uiPriority="66" w:semiHidden="0" w:name="Medium List 2"/>
+    <w:lsdException w:qFormat="1" w:unhideWhenUsed="0" w:uiPriority="66" w:semiHidden="0" w:name="Medium List 2"/>
     <w:lsdException w:unhideWhenUsed="0" w:uiPriority="67" w:semiHidden="0" w:name="Medium Grid 1"/>
     <w:lsdException w:unhideWhenUsed="0" w:uiPriority="68" w:semiHidden="0" w:name="Medium Grid 2"/>
     <w:lsdException w:unhideWhenUsed="0" w:uiPriority="69" w:semiHidden="0" w:name="Medium Grid 3"/>
     <w:lsdException w:unhideWhenUsed="0" w:uiPriority="70" w:semiHidden="0" w:name="Dark List"/>
     <w:lsdException w:unhideWhenUsed="0" w:uiPriority="71" w:semiHidden="0" w:name="Colorful Shading"/>
     <w:lsdException w:unhideWhenUsed="0" w:uiPriority="72" w:semiHidden="0" w:name="Colorful List"/>
-    <w:lsdException w:qFormat="1" w:unhideWhenUsed="0" w:uiPriority="73" w:semiHidden="0" w:name="Colorful Grid"/>
+    <w:lsdException w:unhideWhenUsed="0" w:uiPriority="73" w:semiHidden="0" w:name="Colorful Grid"/>
     <w:lsdException w:qFormat="1" w:unhideWhenUsed="0" w:uiPriority="60" w:semiHidden="0" w:name="Light Shading Accent 1"/>
     <w:lsdException w:unhideWhenUsed="0" w:uiPriority="61" w:semiHidden="0" w:name="Light List Accent 1"/>
     <w:lsdException w:unhideWhenUsed="0" w:uiPriority="62" w:semiHidden="0" w:name="Light Grid Accent 1"/>
@@ -2513,18 +5138,18 @@
     <w:lsdException w:unhideWhenUsed="0" w:uiPriority="65" w:semiHidden="0" w:name="Medium List 1 Accent 1"/>
     <w:lsdException w:qFormat="1" w:unhideWhenUsed="0" w:uiPriority="34" w:semiHidden="0" w:name="List Paragraph"/>
     <w:lsdException w:qFormat="1" w:uiPriority="30" w:name="Intense Quote"/>
-    <w:lsdException w:unhideWhenUsed="0" w:uiPriority="66" w:semiHidden="0" w:name="Medium List 2 Accent 1"/>
+    <w:lsdException w:qFormat="1" w:unhideWhenUsed="0" w:uiPriority="66" w:semiHidden="0" w:name="Medium List 2 Accent 1"/>
     <w:lsdException w:unhideWhenUsed="0" w:uiPriority="67" w:semiHidden="0" w:name="Medium Grid 1 Accent 1"/>
     <w:lsdException w:unhideWhenUsed="0" w:uiPriority="68" w:semiHidden="0" w:name="Medium Grid 2 Accent 1"/>
-    <w:lsdException w:unhideWhenUsed="0" w:uiPriority="69" w:semiHidden="0" w:name="Medium Grid 3 Accent 1"/>
+    <w:lsdException w:qFormat="1" w:unhideWhenUsed="0" w:uiPriority="69" w:semiHidden="0" w:name="Medium Grid 3 Accent 1"/>
     <w:lsdException w:unhideWhenUsed="0" w:uiPriority="70" w:semiHidden="0" w:name="Dark List Accent 1"/>
     <w:lsdException w:unhideWhenUsed="0" w:uiPriority="71" w:semiHidden="0" w:name="Colorful Shading Accent 1"/>
     <w:lsdException w:unhideWhenUsed="0" w:uiPriority="72" w:semiHidden="0" w:name="Colorful List Accent 1"/>
     <w:lsdException w:unhideWhenUsed="0" w:uiPriority="73" w:semiHidden="0" w:name="Colorful Grid Accent 1"/>
     <w:lsdException w:unhideWhenUsed="0" w:uiPriority="60" w:semiHidden="0" w:name="Light Shading Accent 2"/>
-    <w:lsdException w:unhideWhenUsed="0" w:uiPriority="61" w:semiHidden="0" w:name="Light List Accent 2"/>
-    <w:lsdException w:unhideWhenUsed="0" w:uiPriority="62" w:semiHidden="0" w:name="Light Grid Accent 2"/>
-    <w:lsdException w:unhideWhenUsed="0" w:uiPriority="63" w:semiHidden="0" w:name="Medium Shading 1 Accent 2"/>
+    <w:lsdException w:qFormat="1" w:unhideWhenUsed="0" w:uiPriority="61" w:semiHidden="0" w:name="Light List Accent 2"/>
+    <w:lsdException w:qFormat="1" w:unhideWhenUsed="0" w:uiPriority="62" w:semiHidden="0" w:name="Light Grid Accent 2"/>
+    <w:lsdException w:qFormat="1" w:unhideWhenUsed="0" w:uiPriority="63" w:semiHidden="0" w:name="Medium Shading 1 Accent 2"/>
     <w:lsdException w:unhideWhenUsed="0" w:uiPriority="64" w:semiHidden="0" w:name="Medium Shading 2 Accent 2"/>
     <w:lsdException w:unhideWhenUsed="0" w:uiPriority="65" w:semiHidden="0" w:name="Medium List 1 Accent 2"/>
     <w:lsdException w:unhideWhenUsed="0" w:uiPriority="66" w:semiHidden="0" w:name="Medium List 2 Accent 2"/>
@@ -2536,8 +5161,8 @@
     <w:lsdException w:unhideWhenUsed="0" w:uiPriority="72" w:semiHidden="0" w:name="Colorful List Accent 2"/>
     <w:lsdException w:unhideWhenUsed="0" w:uiPriority="73" w:semiHidden="0" w:name="Colorful Grid Accent 2"/>
     <w:lsdException w:unhideWhenUsed="0" w:uiPriority="60" w:semiHidden="0" w:name="Light Shading Accent 3"/>
-    <w:lsdException w:qFormat="1" w:unhideWhenUsed="0" w:uiPriority="61" w:semiHidden="0" w:name="Light List Accent 3"/>
-    <w:lsdException w:unhideWhenUsed="0" w:uiPriority="62" w:semiHidden="0" w:name="Light Grid Accent 3"/>
+    <w:lsdException w:unhideWhenUsed="0" w:uiPriority="61" w:semiHidden="0" w:name="Light List Accent 3"/>
+    <w:lsdException w:qFormat="1" w:unhideWhenUsed="0" w:uiPriority="62" w:semiHidden="0" w:name="Light Grid Accent 3"/>
     <w:lsdException w:unhideWhenUsed="0" w:uiPriority="63" w:semiHidden="0" w:name="Medium Shading 1 Accent 3"/>
     <w:lsdException w:unhideWhenUsed="0" w:uiPriority="64" w:semiHidden="0" w:name="Medium Shading 2 Accent 3"/>
     <w:lsdException w:unhideWhenUsed="0" w:uiPriority="65" w:semiHidden="0" w:name="Medium List 1 Accent 3"/>
@@ -2548,9 +5173,9 @@
     <w:lsdException w:unhideWhenUsed="0" w:uiPriority="70" w:semiHidden="0" w:name="Dark List Accent 3"/>
     <w:lsdException w:unhideWhenUsed="0" w:uiPriority="71" w:semiHidden="0" w:name="Colorful Shading Accent 3"/>
     <w:lsdException w:unhideWhenUsed="0" w:uiPriority="72" w:semiHidden="0" w:name="Colorful List Accent 3"/>
-    <w:lsdException w:unhideWhenUsed="0" w:uiPriority="73" w:semiHidden="0" w:name="Colorful Grid Accent 3"/>
-    <w:lsdException w:qFormat="1" w:unhideWhenUsed="0" w:uiPriority="60" w:semiHidden="0" w:name="Light Shading Accent 4"/>
-    <w:lsdException w:qFormat="1" w:unhideWhenUsed="0" w:uiPriority="61" w:semiHidden="0" w:name="Light List Accent 4"/>
+    <w:lsdException w:qFormat="1" w:unhideWhenUsed="0" w:uiPriority="73" w:semiHidden="0" w:name="Colorful Grid Accent 3"/>
+    <w:lsdException w:unhideWhenUsed="0" w:uiPriority="60" w:semiHidden="0" w:name="Light Shading Accent 4"/>
+    <w:lsdException w:unhideWhenUsed="0" w:uiPriority="61" w:semiHidden="0" w:name="Light List Accent 4"/>
     <w:lsdException w:unhideWhenUsed="0" w:uiPriority="62" w:semiHidden="0" w:name="Light Grid Accent 4"/>
     <w:lsdException w:unhideWhenUsed="0" w:uiPriority="63" w:semiHidden="0" w:name="Medium Shading 1 Accent 4"/>
     <w:lsdException w:unhideWhenUsed="0" w:uiPriority="64" w:semiHidden="0" w:name="Medium Shading 2 Accent 4"/>
@@ -2558,21 +5183,21 @@
     <w:lsdException w:unhideWhenUsed="0" w:uiPriority="66" w:semiHidden="0" w:name="Medium List 2 Accent 4"/>
     <w:lsdException w:unhideWhenUsed="0" w:uiPriority="67" w:semiHidden="0" w:name="Medium Grid 1 Accent 4"/>
     <w:lsdException w:unhideWhenUsed="0" w:uiPriority="68" w:semiHidden="0" w:name="Medium Grid 2 Accent 4"/>
-    <w:lsdException w:unhideWhenUsed="0" w:uiPriority="69" w:semiHidden="0" w:name="Medium Grid 3 Accent 4"/>
+    <w:lsdException w:qFormat="1" w:unhideWhenUsed="0" w:uiPriority="69" w:semiHidden="0" w:name="Medium Grid 3 Accent 4"/>
     <w:lsdException w:unhideWhenUsed="0" w:uiPriority="70" w:semiHidden="0" w:name="Dark List Accent 4"/>
-    <w:lsdException w:unhideWhenUsed="0" w:uiPriority="71" w:semiHidden="0" w:name="Colorful Shading Accent 4"/>
+    <w:lsdException w:qFormat="1" w:unhideWhenUsed="0" w:uiPriority="71" w:semiHidden="0" w:name="Colorful Shading Accent 4"/>
     <w:lsdException w:unhideWhenUsed="0" w:uiPriority="72" w:semiHidden="0" w:name="Colorful List Accent 4"/>
     <w:lsdException w:unhideWhenUsed="0" w:uiPriority="73" w:semiHidden="0" w:name="Colorful Grid Accent 4"/>
-    <w:lsdException w:qFormat="1" w:unhideWhenUsed="0" w:uiPriority="60" w:semiHidden="0" w:name="Light Shading Accent 5"/>
+    <w:lsdException w:unhideWhenUsed="0" w:uiPriority="60" w:semiHidden="0" w:name="Light Shading Accent 5"/>
     <w:lsdException w:unhideWhenUsed="0" w:uiPriority="61" w:semiHidden="0" w:name="Light List Accent 5"/>
     <w:lsdException w:unhideWhenUsed="0" w:uiPriority="62" w:semiHidden="0" w:name="Light Grid Accent 5"/>
     <w:lsdException w:unhideWhenUsed="0" w:uiPriority="63" w:semiHidden="0" w:name="Medium Shading 1 Accent 5"/>
     <w:lsdException w:unhideWhenUsed="0" w:uiPriority="64" w:semiHidden="0" w:name="Medium Shading 2 Accent 5"/>
     <w:lsdException w:unhideWhenUsed="0" w:uiPriority="65" w:semiHidden="0" w:name="Medium List 1 Accent 5"/>
     <w:lsdException w:unhideWhenUsed="0" w:uiPriority="66" w:semiHidden="0" w:name="Medium List 2 Accent 5"/>
-    <w:lsdException w:unhideWhenUsed="0" w:uiPriority="67" w:semiHidden="0" w:name="Medium Grid 1 Accent 5"/>
+    <w:lsdException w:qFormat="1" w:unhideWhenUsed="0" w:uiPriority="67" w:semiHidden="0" w:name="Medium Grid 1 Accent 5"/>
     <w:lsdException w:unhideWhenUsed="0" w:uiPriority="68" w:semiHidden="0" w:name="Medium Grid 2 Accent 5"/>
-    <w:lsdException w:unhideWhenUsed="0" w:uiPriority="69" w:semiHidden="0" w:name="Medium Grid 3 Accent 5"/>
+    <w:lsdException w:qFormat="1" w:unhideWhenUsed="0" w:uiPriority="69" w:semiHidden="0" w:name="Medium Grid 3 Accent 5"/>
     <w:lsdException w:unhideWhenUsed="0" w:uiPriority="70" w:semiHidden="0" w:name="Dark List Accent 5"/>
     <w:lsdException w:unhideWhenUsed="0" w:uiPriority="71" w:semiHidden="0" w:name="Colorful Shading Accent 5"/>
     <w:lsdException w:unhideWhenUsed="0" w:uiPriority="72" w:semiHidden="0" w:name="Colorful List Accent 5"/>
@@ -2583,10 +5208,10 @@
     <w:lsdException w:unhideWhenUsed="0" w:uiPriority="63" w:semiHidden="0" w:name="Medium Shading 1 Accent 6"/>
     <w:lsdException w:unhideWhenUsed="0" w:uiPriority="64" w:semiHidden="0" w:name="Medium Shading 2 Accent 6"/>
     <w:lsdException w:unhideWhenUsed="0" w:uiPriority="65" w:semiHidden="0" w:name="Medium List 1 Accent 6"/>
-    <w:lsdException w:unhideWhenUsed="0" w:uiPriority="66" w:semiHidden="0" w:name="Medium List 2 Accent 6"/>
-    <w:lsdException w:unhideWhenUsed="0" w:uiPriority="67" w:semiHidden="0" w:name="Medium Grid 1 Accent 6"/>
+    <w:lsdException w:qFormat="1" w:unhideWhenUsed="0" w:uiPriority="66" w:semiHidden="0" w:name="Medium List 2 Accent 6"/>
+    <w:lsdException w:qFormat="1" w:unhideWhenUsed="0" w:uiPriority="67" w:semiHidden="0" w:name="Medium Grid 1 Accent 6"/>
     <w:lsdException w:unhideWhenUsed="0" w:uiPriority="68" w:semiHidden="0" w:name="Medium Grid 2 Accent 6"/>
-    <w:lsdException w:unhideWhenUsed="0" w:uiPriority="69" w:semiHidden="0" w:name="Medium Grid 3 Accent 6"/>
+    <w:lsdException w:qFormat="1" w:unhideWhenUsed="0" w:uiPriority="69" w:semiHidden="0" w:name="Medium Grid 3 Accent 6"/>
     <w:lsdException w:unhideWhenUsed="0" w:uiPriority="70" w:semiHidden="0" w:name="Dark List Accent 6"/>
     <w:lsdException w:unhideWhenUsed="0" w:uiPriority="71" w:semiHidden="0" w:name="Colorful Shading Accent 6"/>
     <w:lsdException w:unhideWhenUsed="0" w:uiPriority="72" w:semiHidden="0" w:name="Colorful List Accent 6"/>
@@ -2619,7 +5244,7 @@
     <w:name w:val="heading 1"/>
     <w:basedOn w:val="1"/>
     <w:next w:val="1"/>
-    <w:link w:val="39"/>
+    <w:link w:val="40"/>
     <w:qFormat/>
     <w:uiPriority w:val="9"/>
     <w:pPr>
@@ -2640,7 +5265,7 @@
     <w:name w:val="heading 2"/>
     <w:basedOn w:val="1"/>
     <w:next w:val="1"/>
-    <w:link w:val="40"/>
+    <w:link w:val="41"/>
     <w:unhideWhenUsed/>
     <w:qFormat/>
     <w:uiPriority w:val="9"/>
@@ -2663,7 +5288,7 @@
     <w:name w:val="heading 3"/>
     <w:basedOn w:val="1"/>
     <w:next w:val="1"/>
-    <w:link w:val="47"/>
+    <w:link w:val="48"/>
     <w:semiHidden/>
     <w:unhideWhenUsed/>
     <w:qFormat/>
@@ -2685,7 +5310,7 @@
     <w:name w:val="heading 6"/>
     <w:basedOn w:val="1"/>
     <w:next w:val="1"/>
-    <w:link w:val="67"/>
+    <w:link w:val="68"/>
     <w:semiHidden/>
     <w:unhideWhenUsed/>
     <w:qFormat/>
@@ -2705,7 +5330,7 @@
     <w:name w:val="heading 7"/>
     <w:basedOn w:val="1"/>
     <w:next w:val="1"/>
-    <w:link w:val="66"/>
+    <w:link w:val="67"/>
     <w:semiHidden/>
     <w:unhideWhenUsed/>
     <w:qFormat/>
@@ -2727,7 +5352,7 @@
     <w:name w:val="heading 8"/>
     <w:basedOn w:val="1"/>
     <w:next w:val="1"/>
-    <w:link w:val="48"/>
+    <w:link w:val="49"/>
     <w:semiHidden/>
     <w:unhideWhenUsed/>
     <w:qFormat/>
@@ -2756,7 +5381,7 @@
     <w:name w:val="heading 9"/>
     <w:basedOn w:val="1"/>
     <w:next w:val="1"/>
-    <w:link w:val="49"/>
+    <w:link w:val="50"/>
     <w:semiHidden/>
     <w:unhideWhenUsed/>
     <w:qFormat/>
@@ -2808,7 +5433,7 @@
   <w:style w:type="paragraph" w:styleId="11">
     <w:name w:val="Balloon Text"/>
     <w:basedOn w:val="1"/>
-    <w:link w:val="54"/>
+    <w:link w:val="55"/>
     <w:semiHidden/>
     <w:unhideWhenUsed/>
     <w:qFormat/>
@@ -2847,7 +5472,7 @@
   <w:style w:type="paragraph" w:styleId="13">
     <w:name w:val="Body Text 3"/>
     <w:basedOn w:val="1"/>
-    <w:link w:val="55"/>
+    <w:link w:val="56"/>
     <w:semiHidden/>
     <w:unhideWhenUsed/>
     <w:qFormat/>
@@ -2862,7 +5487,7 @@
   <w:style w:type="paragraph" w:styleId="14">
     <w:name w:val="Body Text Indent 3"/>
     <w:basedOn w:val="1"/>
-    <w:link w:val="56"/>
+    <w:link w:val="57"/>
     <w:semiHidden/>
     <w:unhideWhenUsed/>
     <w:qFormat/>
@@ -2913,7 +5538,7 @@
   <w:style w:type="paragraph" w:styleId="17">
     <w:name w:val="annotation text"/>
     <w:basedOn w:val="1"/>
-    <w:link w:val="57"/>
+    <w:link w:val="58"/>
     <w:semiHidden/>
     <w:unhideWhenUsed/>
     <w:qFormat/>
@@ -2929,7 +5554,7 @@
     <w:name w:val="annotation subject"/>
     <w:basedOn w:val="17"/>
     <w:next w:val="17"/>
-    <w:link w:val="58"/>
+    <w:link w:val="59"/>
     <w:semiHidden/>
     <w:unhideWhenUsed/>
     <w:qFormat/>
@@ -2942,7 +5567,7 @@
   <w:style w:type="paragraph" w:styleId="19">
     <w:name w:val="Document Map"/>
     <w:basedOn w:val="1"/>
-    <w:link w:val="59"/>
+    <w:link w:val="60"/>
     <w:semiHidden/>
     <w:unhideWhenUsed/>
     <w:qFormat/>
@@ -2958,7 +5583,7 @@
   <w:style w:type="paragraph" w:styleId="20">
     <w:name w:val="endnote text"/>
     <w:basedOn w:val="1"/>
-    <w:link w:val="60"/>
+    <w:link w:val="61"/>
     <w:semiHidden/>
     <w:unhideWhenUsed/>
     <w:qFormat/>
@@ -3000,7 +5625,7 @@
   <w:style w:type="paragraph" w:styleId="23">
     <w:name w:val="footer"/>
     <w:basedOn w:val="1"/>
-    <w:link w:val="44"/>
+    <w:link w:val="45"/>
     <w:unhideWhenUsed/>
     <w:qFormat/>
     <w:uiPriority w:val="99"/>
@@ -3015,7 +5640,7 @@
   <w:style w:type="paragraph" w:styleId="24">
     <w:name w:val="footnote text"/>
     <w:basedOn w:val="1"/>
-    <w:link w:val="61"/>
+    <w:link w:val="62"/>
     <w:semiHidden/>
     <w:unhideWhenUsed/>
     <w:qFormat/>
@@ -3030,7 +5655,7 @@
   <w:style w:type="paragraph" w:styleId="25">
     <w:name w:val="header"/>
     <w:basedOn w:val="1"/>
-    <w:link w:val="46"/>
+    <w:link w:val="47"/>
     <w:unhideWhenUsed/>
     <w:qFormat/>
     <w:uiPriority w:val="99"/>
@@ -3067,7 +5692,7 @@
   <w:style w:type="paragraph" w:styleId="28">
     <w:name w:val="HTML Preformatted"/>
     <w:basedOn w:val="1"/>
-    <w:link w:val="62"/>
+    <w:link w:val="63"/>
     <w:semiHidden/>
     <w:unhideWhenUsed/>
     <w:qFormat/>
@@ -3134,7 +5759,7 @@
   </w:style>
   <w:style w:type="paragraph" w:styleId="33">
     <w:name w:val="macro"/>
-    <w:link w:val="63"/>
+    <w:link w:val="64"/>
     <w:semiHidden/>
     <w:unhideWhenUsed/>
     <w:qFormat/>
@@ -3190,7 +5815,7 @@
   <w:style w:type="paragraph" w:styleId="35">
     <w:name w:val="Plain Text"/>
     <w:basedOn w:val="1"/>
-    <w:link w:val="65"/>
+    <w:link w:val="66"/>
     <w:semiHidden/>
     <w:unhideWhenUsed/>
     <w:qFormat/>
@@ -3203,10 +5828,22 @@
       <w:szCs w:val="21"/>
     </w:rPr>
   </w:style>
-  <w:style w:type="paragraph" w:styleId="36">
+  <w:style w:type="character" w:styleId="36">
+    <w:name w:val="Strong"/>
+    <w:basedOn w:val="9"/>
+    <w:semiHidden/>
+    <w:unhideWhenUsed/>
+    <w:qFormat/>
+    <w:uiPriority w:val="22"/>
+    <w:rPr>
+      <w:b/>
+      <w:bCs/>
+    </w:rPr>
+  </w:style>
+  <w:style w:type="paragraph" w:styleId="37">
     <w:name w:val="Subtitle"/>
     <w:basedOn w:val="1"/>
-    <w:link w:val="43"/>
+    <w:link w:val="44"/>
     <w:unhideWhenUsed/>
     <w:qFormat/>
     <w:uiPriority w:val="3"/>
@@ -3221,9 +5858,10 @@
       <w:sz w:val="26"/>
     </w:rPr>
   </w:style>
-  <w:style w:type="table" w:styleId="37">
+  <w:style w:type="table" w:styleId="38">
     <w:name w:val="Table Grid"/>
     <w:basedOn w:val="10"/>
+    <w:qFormat/>
     <w:uiPriority w:val="39"/>
     <w:pPr>
       <w:spacing w:before="0" w:after="0" w:line="240" w:lineRule="auto"/>
@@ -3239,10 +5877,10 @@
       </w:tblBorders>
     </w:tblPr>
   </w:style>
-  <w:style w:type="paragraph" w:styleId="38">
+  <w:style w:type="paragraph" w:styleId="39">
     <w:name w:val="Title"/>
     <w:basedOn w:val="1"/>
-    <w:link w:val="42"/>
+    <w:link w:val="43"/>
     <w:unhideWhenUsed/>
     <w:qFormat/>
     <w:uiPriority w:val="2"/>
@@ -3258,7 +5896,7 @@
       <w:sz w:val="60"/>
     </w:rPr>
   </w:style>
-  <w:style w:type="character" w:customStyle="1" w:styleId="39">
+  <w:style w:type="character" w:customStyle="1" w:styleId="40">
     <w:name w:val="Heading 1 Char"/>
     <w:basedOn w:val="9"/>
     <w:link w:val="2"/>
@@ -3271,7 +5909,7 @@
       <w:sz w:val="32"/>
     </w:rPr>
   </w:style>
-  <w:style w:type="character" w:customStyle="1" w:styleId="40">
+  <w:style w:type="character" w:customStyle="1" w:styleId="41">
     <w:name w:val="Heading 2 Char"/>
     <w:basedOn w:val="9"/>
     <w:link w:val="3"/>
@@ -3285,7 +5923,7 @@
       <w:sz w:val="28"/>
     </w:rPr>
   </w:style>
-  <w:style w:type="paragraph" w:customStyle="1" w:styleId="41">
+  <w:style w:type="paragraph" w:customStyle="1" w:styleId="42">
     <w:name w:val="Contact Info"/>
     <w:basedOn w:val="1"/>
     <w:qFormat/>
@@ -3295,10 +5933,10 @@
       <w:jc w:val="center"/>
     </w:pPr>
   </w:style>
-  <w:style w:type="character" w:customStyle="1" w:styleId="42">
+  <w:style w:type="character" w:customStyle="1" w:styleId="43">
     <w:name w:val="Title Char"/>
     <w:basedOn w:val="9"/>
-    <w:link w:val="38"/>
+    <w:link w:val="39"/>
     <w:qFormat/>
     <w:uiPriority w:val="2"/>
     <w:rPr>
@@ -3308,10 +5946,10 @@
       <w:sz w:val="60"/>
     </w:rPr>
   </w:style>
-  <w:style w:type="character" w:customStyle="1" w:styleId="43">
+  <w:style w:type="character" w:customStyle="1" w:styleId="44">
     <w:name w:val="Subtitle Char"/>
     <w:basedOn w:val="9"/>
-    <w:link w:val="36"/>
+    <w:link w:val="37"/>
     <w:qFormat/>
     <w:uiPriority w:val="3"/>
     <w:rPr>
@@ -3320,7 +5958,7 @@
       <w:sz w:val="26"/>
     </w:rPr>
   </w:style>
-  <w:style w:type="character" w:customStyle="1" w:styleId="44">
+  <w:style w:type="character" w:customStyle="1" w:styleId="45">
     <w:name w:val="Footer Char"/>
     <w:basedOn w:val="9"/>
     <w:link w:val="23"/>
@@ -3330,7 +5968,7 @@
       <w:caps/>
     </w:rPr>
   </w:style>
-  <w:style w:type="paragraph" w:customStyle="1" w:styleId="45">
+  <w:style w:type="paragraph" w:customStyle="1" w:styleId="46">
     <w:name w:val="Photo"/>
     <w:basedOn w:val="1"/>
     <w:qFormat/>
@@ -3340,7 +5978,7 @@
       <w:jc w:val="center"/>
     </w:pPr>
   </w:style>
-  <w:style w:type="character" w:customStyle="1" w:styleId="46">
+  <w:style w:type="character" w:customStyle="1" w:styleId="47">
     <w:name w:val="Header Char"/>
     <w:basedOn w:val="9"/>
     <w:link w:val="25"/>
@@ -3361,7 +5999,7 @@
       </w14:textFill>
     </w:rPr>
   </w:style>
-  <w:style w:type="character" w:customStyle="1" w:styleId="47">
+  <w:style w:type="character" w:customStyle="1" w:styleId="48">
     <w:name w:val="Heading 3 Char"/>
     <w:basedOn w:val="9"/>
     <w:link w:val="4"/>
@@ -3375,7 +6013,7 @@
       <w:szCs w:val="24"/>
     </w:rPr>
   </w:style>
-  <w:style w:type="character" w:customStyle="1" w:styleId="48">
+  <w:style w:type="character" w:customStyle="1" w:styleId="49">
     <w:name w:val="Heading 8 Char"/>
     <w:basedOn w:val="9"/>
     <w:link w:val="7"/>
@@ -3396,7 +6034,7 @@
       </w14:textFill>
     </w:rPr>
   </w:style>
-  <w:style w:type="character" w:customStyle="1" w:styleId="49">
+  <w:style w:type="character" w:customStyle="1" w:styleId="50">
     <w:name w:val="Heading 9 Char"/>
     <w:basedOn w:val="9"/>
     <w:link w:val="8"/>
@@ -3419,7 +6057,7 @@
       </w14:textFill>
     </w:rPr>
   </w:style>
-  <w:style w:type="character" w:customStyle="1" w:styleId="50">
+  <w:style w:type="character" w:customStyle="1" w:styleId="51">
     <w:name w:val="Intense Emphasis"/>
     <w:basedOn w:val="9"/>
     <w:semiHidden/>
@@ -3432,11 +6070,11 @@
       <w:color w:val="00788A" w:themeColor="accent1" w:themeShade="BF"/>
     </w:rPr>
   </w:style>
-  <w:style w:type="paragraph" w:styleId="51">
+  <w:style w:type="paragraph" w:styleId="52">
     <w:name w:val="Intense Quote"/>
     <w:basedOn w:val="1"/>
     <w:next w:val="1"/>
-    <w:link w:val="52"/>
+    <w:link w:val="53"/>
     <w:semiHidden/>
     <w:unhideWhenUsed/>
     <w:qFormat/>
@@ -3456,10 +6094,10 @@
       <w:color w:val="00788A" w:themeColor="accent1" w:themeShade="BF"/>
     </w:rPr>
   </w:style>
-  <w:style w:type="character" w:customStyle="1" w:styleId="52">
+  <w:style w:type="character" w:customStyle="1" w:styleId="53">
     <w:name w:val="Intense Quote Char"/>
     <w:basedOn w:val="9"/>
-    <w:link w:val="51"/>
+    <w:link w:val="52"/>
     <w:semiHidden/>
     <w:qFormat/>
     <w:uiPriority w:val="30"/>
@@ -3469,7 +6107,7 @@
       <w:color w:val="00788A" w:themeColor="accent1" w:themeShade="BF"/>
     </w:rPr>
   </w:style>
-  <w:style w:type="character" w:customStyle="1" w:styleId="53">
+  <w:style w:type="character" w:customStyle="1" w:styleId="54">
     <w:name w:val="Intense Reference"/>
     <w:basedOn w:val="9"/>
     <w:semiHidden/>
@@ -3484,7 +6122,7 @@
       <w:spacing w:val="5"/>
     </w:rPr>
   </w:style>
-  <w:style w:type="character" w:customStyle="1" w:styleId="54">
+  <w:style w:type="character" w:customStyle="1" w:styleId="55">
     <w:name w:val="Balloon Text Char"/>
     <w:basedOn w:val="9"/>
     <w:link w:val="11"/>
@@ -3496,7 +6134,7 @@
       <w:szCs w:val="18"/>
     </w:rPr>
   </w:style>
-  <w:style w:type="character" w:customStyle="1" w:styleId="55">
+  <w:style w:type="character" w:customStyle="1" w:styleId="56">
     <w:name w:val="Body Text 3 Char"/>
     <w:basedOn w:val="9"/>
     <w:link w:val="13"/>
@@ -3507,7 +6145,7 @@
       <w:szCs w:val="16"/>
     </w:rPr>
   </w:style>
-  <w:style w:type="character" w:customStyle="1" w:styleId="56">
+  <w:style w:type="character" w:customStyle="1" w:styleId="57">
     <w:name w:val="Body Text Indent 3 Char"/>
     <w:basedOn w:val="9"/>
     <w:link w:val="14"/>
@@ -3518,7 +6156,7 @@
       <w:szCs w:val="16"/>
     </w:rPr>
   </w:style>
-  <w:style w:type="character" w:customStyle="1" w:styleId="57">
+  <w:style w:type="character" w:customStyle="1" w:styleId="58">
     <w:name w:val="Comment Text Char"/>
     <w:basedOn w:val="9"/>
     <w:link w:val="17"/>
@@ -3529,9 +6167,9 @@
       <w:szCs w:val="20"/>
     </w:rPr>
   </w:style>
-  <w:style w:type="character" w:customStyle="1" w:styleId="58">
+  <w:style w:type="character" w:customStyle="1" w:styleId="59">
     <w:name w:val="Comment Subject Char"/>
-    <w:basedOn w:val="57"/>
+    <w:basedOn w:val="58"/>
     <w:link w:val="18"/>
     <w:semiHidden/>
     <w:qFormat/>
@@ -3542,7 +6180,7 @@
       <w:szCs w:val="20"/>
     </w:rPr>
   </w:style>
-  <w:style w:type="character" w:customStyle="1" w:styleId="59">
+  <w:style w:type="character" w:customStyle="1" w:styleId="60">
     <w:name w:val="Document Map Char"/>
     <w:basedOn w:val="9"/>
     <w:link w:val="19"/>
@@ -3554,7 +6192,7 @@
       <w:szCs w:val="16"/>
     </w:rPr>
   </w:style>
-  <w:style w:type="character" w:customStyle="1" w:styleId="60">
+  <w:style w:type="character" w:customStyle="1" w:styleId="61">
     <w:name w:val="Endnote Text Char"/>
     <w:basedOn w:val="9"/>
     <w:link w:val="20"/>
@@ -3565,7 +6203,7 @@
       <w:szCs w:val="20"/>
     </w:rPr>
   </w:style>
-  <w:style w:type="character" w:customStyle="1" w:styleId="61">
+  <w:style w:type="character" w:customStyle="1" w:styleId="62">
     <w:name w:val="Footnote Text Char"/>
     <w:basedOn w:val="9"/>
     <w:link w:val="24"/>
@@ -3576,7 +6214,7 @@
       <w:szCs w:val="20"/>
     </w:rPr>
   </w:style>
-  <w:style w:type="character" w:customStyle="1" w:styleId="62">
+  <w:style w:type="character" w:customStyle="1" w:styleId="63">
     <w:name w:val="HTML Preformatted Char"/>
     <w:basedOn w:val="9"/>
     <w:link w:val="28"/>
@@ -3588,7 +6226,7 @@
       <w:szCs w:val="20"/>
     </w:rPr>
   </w:style>
-  <w:style w:type="character" w:customStyle="1" w:styleId="63">
+  <w:style w:type="character" w:customStyle="1" w:styleId="64">
     <w:name w:val="Macro Text Char"/>
     <w:basedOn w:val="9"/>
     <w:link w:val="33"/>
@@ -3600,7 +6238,7 @@
       <w:szCs w:val="20"/>
     </w:rPr>
   </w:style>
-  <w:style w:type="character" w:styleId="64">
+  <w:style w:type="character" w:styleId="65">
     <w:name w:val="Placeholder Text"/>
     <w:basedOn w:val="9"/>
     <w:semiHidden/>
@@ -3618,7 +6256,7 @@
       </w14:textFill>
     </w:rPr>
   </w:style>
-  <w:style w:type="character" w:customStyle="1" w:styleId="65">
+  <w:style w:type="character" w:customStyle="1" w:styleId="66">
     <w:name w:val="Plain Text Char"/>
     <w:basedOn w:val="9"/>
     <w:link w:val="35"/>
@@ -3630,7 +6268,7 @@
       <w:szCs w:val="21"/>
     </w:rPr>
   </w:style>
-  <w:style w:type="character" w:customStyle="1" w:styleId="66">
+  <w:style w:type="character" w:customStyle="1" w:styleId="67">
     <w:name w:val="Heading 7 Char"/>
     <w:basedOn w:val="9"/>
     <w:link w:val="6"/>
@@ -3644,7 +6282,7 @@
       <w:color w:val="00505C" w:themeColor="accent1" w:themeShade="80"/>
     </w:rPr>
   </w:style>
-  <w:style w:type="character" w:customStyle="1" w:styleId="67">
+  <w:style w:type="character" w:customStyle="1" w:styleId="68">
     <w:name w:val="Heading 6 Char"/>
     <w:basedOn w:val="9"/>
     <w:link w:val="5"/>
@@ -3656,7 +6294,7 @@
       <w:color w:val="00505C" w:themeColor="accent1" w:themeShade="80"/>
     </w:rPr>
   </w:style>
-  <w:style w:type="paragraph" w:customStyle="1" w:styleId="68">
+  <w:style w:type="paragraph" w:customStyle="1" w:styleId="69">
     <w:name w:val="AE7004CF66524D8096D2571B49637CE5"/>
     <w:qFormat/>
     <w:uiPriority w:val="0"/>
@@ -3671,7 +6309,7 @@
       <w:lang w:val="en-AU" w:eastAsia="en-AU" w:bidi="ar-SA"/>
     </w:rPr>
   </w:style>
-  <w:style w:type="paragraph" w:styleId="69">
+  <w:style w:type="paragraph" w:styleId="70">
     <w:name w:val="List Paragraph"/>
     <w:basedOn w:val="1"/>
     <w:qFormat/>

</xml_diff>